<commit_message>
Empty places, segment editor, Alembic, browser sign-in, wiring and harness views
- Plugin: empty pins of known inserts (20FD19) stored in the model, shown in the connectors view and the Excel export
- API/UI: PATCH segment (diameter, BOM items) with a logged trace, "Corriger ce segment" form, Source column in Excel
- Excel cover: no yellow cells (fills and conditional formatting removed)
- Browser sign-in: silent token renewal, re-authentication on 401
- Alembic migrations (0001 imports, 0002 updated_at) applied at start-up
- Wiring view: frame and title block removed, zoom fitted to the useful content
- Harness view: clicking a connector highlights the routes of its wires
- Docs: README, architecture, plugin guide, API, operations; manual rebuilt (Hemeria wording, new figures)

Co-Authored-By: Claude Sonnet 5.5 <noreply@anthropic.com>
</commit_message>
<xml_diff>
--- a/docs/manual/ARIANE-manuel-utilisateur.docx
+++ b/docs/manual/ARIANE-manuel-utilisateur.docx
@@ -99,7 +99,7 @@
     <w:sdt>
       <w:sdtPr>
         <w:alias w:val="Sommaire"/>
-        <w:id w:val="1478024809"/>
+        <w:id w:val="-1187598476"/>
       </w:sdtPr>
       <w:sdtEndPr/>
       <w:sdtContent>
@@ -127,7 +127,7 @@
           <w:r>
             <w:fldChar w:fldCharType="separate"/>
           </w:r>
-          <w:hyperlink w:anchor="_Toc243993270" w:history="1">
+          <w:hyperlink w:anchor="_Toc244015083" w:history="1">
             <w:r>
               <w:rPr>
                 <w:rStyle w:val="Hyperlink"/>
@@ -151,7 +151,7 @@
               <w:rPr>
                 <w:noProof/>
               </w:rPr>
-              <w:instrText xml:space="preserve"> PAGEREF _Toc243993270 \h </w:instrText>
+              <w:instrText xml:space="preserve"> PAGEREF _Toc244015083 \h </w:instrText>
             </w:r>
             <w:r>
               <w:rPr>
@@ -193,7 +193,7 @@
               <w14:ligatures w14:val="standardContextual"/>
             </w:rPr>
           </w:pPr>
-          <w:hyperlink w:anchor="_Toc243993271" w:history="1">
+          <w:hyperlink w:anchor="_Toc244015084" w:history="1">
             <w:r>
               <w:rPr>
                 <w:rStyle w:val="Hyperlink"/>
@@ -217,7 +217,7 @@
               <w:rPr>
                 <w:noProof/>
               </w:rPr>
-              <w:instrText xml:space="preserve"> PAGEREF _Toc243993271 \h </w:instrText>
+              <w:instrText xml:space="preserve"> PAGEREF _Toc244015084 \h </w:instrText>
             </w:r>
             <w:r>
               <w:rPr>
@@ -259,7 +259,7 @@
               <w14:ligatures w14:val="standardContextual"/>
             </w:rPr>
           </w:pPr>
-          <w:hyperlink w:anchor="_Toc243993272" w:history="1">
+          <w:hyperlink w:anchor="_Toc244015085" w:history="1">
             <w:r>
               <w:rPr>
                 <w:rStyle w:val="Hyperlink"/>
@@ -283,7 +283,7 @@
               <w:rPr>
                 <w:noProof/>
               </w:rPr>
-              <w:instrText xml:space="preserve"> PAGEREF _Toc243993272 \h </w:instrText>
+              <w:instrText xml:space="preserve"> PAGEREF _Toc244015085 \h </w:instrText>
             </w:r>
             <w:r>
               <w:rPr>
@@ -300,7 +300,7 @@
               <w:rPr>
                 <w:noProof/>
               </w:rPr>
-              <w:t>5</w:t>
+              <w:t>6</w:t>
             </w:r>
             <w:r>
               <w:rPr>
@@ -325,7 +325,7 @@
               <w14:ligatures w14:val="standardContextual"/>
             </w:rPr>
           </w:pPr>
-          <w:hyperlink w:anchor="_Toc243993273" w:history="1">
+          <w:hyperlink w:anchor="_Toc244015086" w:history="1">
             <w:r>
               <w:rPr>
                 <w:rStyle w:val="Hyperlink"/>
@@ -349,7 +349,7 @@
               <w:rPr>
                 <w:noProof/>
               </w:rPr>
-              <w:instrText xml:space="preserve"> PAGEREF _Toc243993273 \h </w:instrText>
+              <w:instrText xml:space="preserve"> PAGEREF _Toc244015086 \h </w:instrText>
             </w:r>
             <w:r>
               <w:rPr>
@@ -366,7 +366,7 @@
               <w:rPr>
                 <w:noProof/>
               </w:rPr>
-              <w:t>5</w:t>
+              <w:t>6</w:t>
             </w:r>
             <w:r>
               <w:rPr>
@@ -391,7 +391,7 @@
               <w14:ligatures w14:val="standardContextual"/>
             </w:rPr>
           </w:pPr>
-          <w:hyperlink w:anchor="_Toc243993274" w:history="1">
+          <w:hyperlink w:anchor="_Toc244015087" w:history="1">
             <w:r>
               <w:rPr>
                 <w:rStyle w:val="Hyperlink"/>
@@ -415,7 +415,7 @@
               <w:rPr>
                 <w:noProof/>
               </w:rPr>
-              <w:instrText xml:space="preserve"> PAGEREF _Toc243993274 \h </w:instrText>
+              <w:instrText xml:space="preserve"> PAGEREF _Toc244015087 \h </w:instrText>
             </w:r>
             <w:r>
               <w:rPr>
@@ -432,7 +432,7 @@
               <w:rPr>
                 <w:noProof/>
               </w:rPr>
-              <w:t>7</w:t>
+              <w:t>8</w:t>
             </w:r>
             <w:r>
               <w:rPr>
@@ -457,7 +457,7 @@
               <w14:ligatures w14:val="standardContextual"/>
             </w:rPr>
           </w:pPr>
-          <w:hyperlink w:anchor="_Toc243993275" w:history="1">
+          <w:hyperlink w:anchor="_Toc244015088" w:history="1">
             <w:r>
               <w:rPr>
                 <w:rStyle w:val="Hyperlink"/>
@@ -481,7 +481,7 @@
               <w:rPr>
                 <w:noProof/>
               </w:rPr>
-              <w:instrText xml:space="preserve"> PAGEREF _Toc243993275 \h </w:instrText>
+              <w:instrText xml:space="preserve"> PAGEREF _Toc244015088 \h </w:instrText>
             </w:r>
             <w:r>
               <w:rPr>
@@ -498,7 +498,7 @@
               <w:rPr>
                 <w:noProof/>
               </w:rPr>
-              <w:t>7</w:t>
+              <w:t>8</w:t>
             </w:r>
             <w:r>
               <w:rPr>
@@ -523,7 +523,7 @@
               <w14:ligatures w14:val="standardContextual"/>
             </w:rPr>
           </w:pPr>
-          <w:hyperlink w:anchor="_Toc243993276" w:history="1">
+          <w:hyperlink w:anchor="_Toc244015089" w:history="1">
             <w:r>
               <w:rPr>
                 <w:rStyle w:val="Hyperlink"/>
@@ -547,7 +547,7 @@
               <w:rPr>
                 <w:noProof/>
               </w:rPr>
-              <w:instrText xml:space="preserve"> PAGEREF _Toc243993276 \h </w:instrText>
+              <w:instrText xml:space="preserve"> PAGEREF _Toc244015089 \h </w:instrText>
             </w:r>
             <w:r>
               <w:rPr>
@@ -564,7 +564,7 @@
               <w:rPr>
                 <w:noProof/>
               </w:rPr>
-              <w:t>7</w:t>
+              <w:t>8</w:t>
             </w:r>
             <w:r>
               <w:rPr>
@@ -589,7 +589,7 @@
               <w14:ligatures w14:val="standardContextual"/>
             </w:rPr>
           </w:pPr>
-          <w:hyperlink w:anchor="_Toc243993277" w:history="1">
+          <w:hyperlink w:anchor="_Toc244015090" w:history="1">
             <w:r>
               <w:rPr>
                 <w:rStyle w:val="Hyperlink"/>
@@ -613,7 +613,7 @@
               <w:rPr>
                 <w:noProof/>
               </w:rPr>
-              <w:instrText xml:space="preserve"> PAGEREF _Toc243993277 \h </w:instrText>
+              <w:instrText xml:space="preserve"> PAGEREF _Toc244015090 \h </w:instrText>
             </w:r>
             <w:r>
               <w:rPr>
@@ -630,7 +630,7 @@
               <w:rPr>
                 <w:noProof/>
               </w:rPr>
-              <w:t>9</w:t>
+              <w:t>10</w:t>
             </w:r>
             <w:r>
               <w:rPr>
@@ -655,7 +655,7 @@
               <w14:ligatures w14:val="standardContextual"/>
             </w:rPr>
           </w:pPr>
-          <w:hyperlink w:anchor="_Toc243993278" w:history="1">
+          <w:hyperlink w:anchor="_Toc244015091" w:history="1">
             <w:r>
               <w:rPr>
                 <w:rStyle w:val="Hyperlink"/>
@@ -679,7 +679,7 @@
               <w:rPr>
                 <w:noProof/>
               </w:rPr>
-              <w:instrText xml:space="preserve"> PAGEREF _Toc243993278 \h </w:instrText>
+              <w:instrText xml:space="preserve"> PAGEREF _Toc244015091 \h </w:instrText>
             </w:r>
             <w:r>
               <w:rPr>
@@ -696,7 +696,73 @@
               <w:rPr>
                 <w:noProof/>
               </w:rPr>
-              <w:t>10</w:t>
+              <w:t>11</w:t>
+            </w:r>
+            <w:r>
+              <w:rPr>
+                <w:noProof/>
+              </w:rPr>
+              <w:fldChar w:fldCharType="end"/>
+            </w:r>
+          </w:hyperlink>
+        </w:p>
+        <w:p>
+          <w:pPr>
+            <w:pStyle w:val="TOC2"/>
+            <w:tabs>
+              <w:tab w:val="right" w:leader="dot" w:pos="9628"/>
+            </w:tabs>
+            <w:rPr>
+              <w:rFonts w:asciiTheme="minorHAnsi" w:eastAsiaTheme="minorEastAsia" w:hAnsiTheme="minorHAnsi" w:cstheme="minorBidi"/>
+              <w:noProof/>
+              <w:kern w:val="2"/>
+              <w:sz w:val="24"/>
+              <w:szCs w:val="24"/>
+              <w14:ligatures w14:val="standardContextual"/>
+            </w:rPr>
+          </w:pPr>
+          <w:hyperlink w:anchor="_Toc244015092" w:history="1">
+            <w:r>
+              <w:rPr>
+                <w:rStyle w:val="Hyperlink"/>
+                <w:noProof/>
+              </w:rPr>
+              <w:t>4.5 Corriger un segment</w:t>
+            </w:r>
+            <w:r>
+              <w:rPr>
+                <w:noProof/>
+              </w:rPr>
+              <w:tab/>
+            </w:r>
+            <w:r>
+              <w:rPr>
+                <w:noProof/>
+              </w:rPr>
+              <w:fldChar w:fldCharType="begin"/>
+            </w:r>
+            <w:r>
+              <w:rPr>
+                <w:noProof/>
+              </w:rPr>
+              <w:instrText xml:space="preserve"> PAGEREF _Toc244015092 \h </w:instrText>
+            </w:r>
+            <w:r>
+              <w:rPr>
+                <w:noProof/>
+              </w:rPr>
+            </w:r>
+            <w:r>
+              <w:rPr>
+                <w:noProof/>
+              </w:rPr>
+              <w:fldChar w:fldCharType="separate"/>
+            </w:r>
+            <w:r>
+              <w:rPr>
+                <w:noProof/>
+              </w:rPr>
+              <w:t>11</w:t>
             </w:r>
             <w:r>
               <w:rPr>
@@ -721,7 +787,7 @@
               <w14:ligatures w14:val="standardContextual"/>
             </w:rPr>
           </w:pPr>
-          <w:hyperlink w:anchor="_Toc243993279" w:history="1">
+          <w:hyperlink w:anchor="_Toc244015093" w:history="1">
             <w:r>
               <w:rPr>
                 <w:rStyle w:val="Hyperlink"/>
@@ -745,7 +811,7 @@
               <w:rPr>
                 <w:noProof/>
               </w:rPr>
-              <w:instrText xml:space="preserve"> PAGEREF _Toc243993279 \h </w:instrText>
+              <w:instrText xml:space="preserve"> PAGEREF _Toc244015093 \h </w:instrText>
             </w:r>
             <w:r>
               <w:rPr>
@@ -762,7 +828,7 @@
               <w:rPr>
                 <w:noProof/>
               </w:rPr>
-              <w:t>11</w:t>
+              <w:t>13</w:t>
             </w:r>
             <w:r>
               <w:rPr>
@@ -787,7 +853,7 @@
               <w14:ligatures w14:val="standardContextual"/>
             </w:rPr>
           </w:pPr>
-          <w:hyperlink w:anchor="_Toc243993280" w:history="1">
+          <w:hyperlink w:anchor="_Toc244015094" w:history="1">
             <w:r>
               <w:rPr>
                 <w:rStyle w:val="Hyperlink"/>
@@ -811,7 +877,7 @@
               <w:rPr>
                 <w:noProof/>
               </w:rPr>
-              <w:instrText xml:space="preserve"> PAGEREF _Toc243993280 \h </w:instrText>
+              <w:instrText xml:space="preserve"> PAGEREF _Toc244015094 \h </w:instrText>
             </w:r>
             <w:r>
               <w:rPr>
@@ -828,7 +894,7 @@
               <w:rPr>
                 <w:noProof/>
               </w:rPr>
-              <w:t>12</w:t>
+              <w:t>14</w:t>
             </w:r>
             <w:r>
               <w:rPr>
@@ -853,7 +919,7 @@
               <w14:ligatures w14:val="standardContextual"/>
             </w:rPr>
           </w:pPr>
-          <w:hyperlink w:anchor="_Toc243993281" w:history="1">
+          <w:hyperlink w:anchor="_Toc244015095" w:history="1">
             <w:r>
               <w:rPr>
                 <w:rStyle w:val="Hyperlink"/>
@@ -877,7 +943,7 @@
               <w:rPr>
                 <w:noProof/>
               </w:rPr>
-              <w:instrText xml:space="preserve"> PAGEREF _Toc243993281 \h </w:instrText>
+              <w:instrText xml:space="preserve"> PAGEREF _Toc244015095 \h </w:instrText>
             </w:r>
             <w:r>
               <w:rPr>
@@ -894,7 +960,7 @@
               <w:rPr>
                 <w:noProof/>
               </w:rPr>
-              <w:t>12</w:t>
+              <w:t>14</w:t>
             </w:r>
             <w:r>
               <w:rPr>
@@ -919,7 +985,7 @@
               <w14:ligatures w14:val="standardContextual"/>
             </w:rPr>
           </w:pPr>
-          <w:hyperlink w:anchor="_Toc243993282" w:history="1">
+          <w:hyperlink w:anchor="_Toc244015096" w:history="1">
             <w:r>
               <w:rPr>
                 <w:rStyle w:val="Hyperlink"/>
@@ -943,7 +1009,7 @@
               <w:rPr>
                 <w:noProof/>
               </w:rPr>
-              <w:instrText xml:space="preserve"> PAGEREF _Toc243993282 \h </w:instrText>
+              <w:instrText xml:space="preserve"> PAGEREF _Toc244015096 \h </w:instrText>
             </w:r>
             <w:r>
               <w:rPr>
@@ -960,7 +1026,7 @@
               <w:rPr>
                 <w:noProof/>
               </w:rPr>
-              <w:t>12</w:t>
+              <w:t>14</w:t>
             </w:r>
             <w:r>
               <w:rPr>
@@ -985,7 +1051,7 @@
               <w14:ligatures w14:val="standardContextual"/>
             </w:rPr>
           </w:pPr>
-          <w:hyperlink w:anchor="_Toc243993283" w:history="1">
+          <w:hyperlink w:anchor="_Toc244015097" w:history="1">
             <w:r>
               <w:rPr>
                 <w:rStyle w:val="Hyperlink"/>
@@ -1009,7 +1075,7 @@
               <w:rPr>
                 <w:noProof/>
               </w:rPr>
-              <w:instrText xml:space="preserve"> PAGEREF _Toc243993283 \h </w:instrText>
+              <w:instrText xml:space="preserve"> PAGEREF _Toc244015097 \h </w:instrText>
             </w:r>
             <w:r>
               <w:rPr>
@@ -1026,7 +1092,7 @@
               <w:rPr>
                 <w:noProof/>
               </w:rPr>
-              <w:t>16</w:t>
+              <w:t>17</w:t>
             </w:r>
             <w:r>
               <w:rPr>
@@ -1048,7 +1114,7 @@
         <w:pStyle w:val="Heading1"/>
         <w:pageBreakBefore/>
       </w:pPr>
-      <w:bookmarkStart w:id="0" w:name="_Toc243993270"/>
+      <w:bookmarkStart w:id="0" w:name="_Toc244015083"/>
       <w:r>
         <w:t>1. À quoi sert ARIANE</w:t>
       </w:r>
@@ -1067,7 +1133,7 @@
         <w:spacing w:after="120" w:line="276" w:lineRule="auto"/>
       </w:pPr>
       <w:r>
-        <w:t>L'analyse se fait sur le serveur ARIANE de votre entreprise. Aucun service externe n'est appelé. Les PDF ne sont pas conservés : seul le résultat de l'analyse est enregistré, et il n'est visible que par les utilisateurs du même client.</w:t>
+        <w:t>L'analyse se fait sur le serveur ARIANE d'Hemeria. Aucun service externe n'est appelé. Les PDF ne sont pas conservés : seul le résultat de l'analyse est enregistré, et il n'est visible que par les utilisateurs du même client.</w:t>
       </w:r>
     </w:p>
     <w:p>
@@ -1091,7 +1157,7 @@
         <w:pStyle w:val="Heading1"/>
         <w:pageBreakBefore/>
       </w:pPr>
-      <w:bookmarkStart w:id="1" w:name="_Toc243993271"/>
+      <w:bookmarkStart w:id="1" w:name="_Toc244015084"/>
       <w:r>
         <w:t>2. Ouvrir l'application</w:t>
       </w:r>
@@ -1102,15 +1168,7 @@
         <w:spacing w:after="120" w:line="276" w:lineRule="auto"/>
       </w:pPr>
       <w:r>
-        <w:t>ARIANE s'ouvre dans un navigateur. La connexion passe par l'annuaire de l'entreprise (Keycloak) : vous saisissez vos identifiants sur la page de connexion, puis vous revenez sur ARIANE. Votre compte porte le nom de votre client, ce qui détermine les plugins proposés et les analyses visibles.</w:t>
-      </w:r>
-    </w:p>
-    <w:p>
-      <w:pPr>
-        <w:spacing w:after="120" w:line="276" w:lineRule="auto"/>
-      </w:pPr>
-      <w:r>
-        <w:t>L'écran d'accueil comporte quatre zones (figure 1). La bande sombre du haut affiche le nom du plugin et de la référence analysée, votre client et votre identifiant, ainsi que les compteurs d'erreurs et d'alertes une fois une analyse chargée. Le panneau de gauche regroupe l'import, l'historique, la recherche et les exports. Les onglets et la vue active occupent le centre. Le panneau de droite détaille l'élément sélectionné.</w:t>
+        <w:t>ARIANE s'ouvre dans un navigateur. La connexion passe par l'annuaire Hemeria (Keycloak) : vous saisissez vos identifiants sur la page de connexion (figure 1), puis vous revenez sur ARIANE. Votre compte porte le nom de votre client, ce qui détermine les plugins proposés et les analyses visibles. Au premier accès, Keycloak vous demande de choisir un nouveau mot de passe.</w:t>
       </w:r>
     </w:p>
     <w:p>
@@ -1124,10 +1182,10 @@
           <w:noProof/>
         </w:rPr>
         <w:drawing>
-          <wp:inline distT="0" distB="0" distL="0" distR="0" wp14:anchorId="3E296957" wp14:editId="55BB1675">
-            <wp:extent cx="5905500" cy="3505200"/>
+          <wp:inline distT="0" distB="0" distL="0" distR="0" wp14:anchorId="0C99139A" wp14:editId="6791C127">
+            <wp:extent cx="4000500" cy="2571750"/>
             <wp:effectExtent l="0" t="0" r="0" b="0"/>
-            <wp:docPr id="1" name="01-accueil.png" descr="Écran d'accueil, avant toute analyse." title="Écran d'accueil, avant toute analyse."/>
+            <wp:docPr id="1" name="00-connexion.png" descr="La page de connexion Hemeria." title="La page de connexion Hemeria."/>
             <wp:cNvGraphicFramePr>
               <a:graphicFrameLocks xmlns:a="http://schemas.openxmlformats.org/drawingml/2006/main" noChangeAspect="1"/>
             </wp:cNvGraphicFramePr>
@@ -1150,7 +1208,7 @@
                   <pic:spPr bwMode="auto">
                     <a:xfrm>
                       <a:off x="0" y="0"/>
-                      <a:ext cx="5905500" cy="3505200"/>
+                      <a:ext cx="4000500" cy="2571750"/>
                     </a:xfrm>
                     <a:prstGeom prst="rect">
                       <a:avLst/>
@@ -1176,7 +1234,7 @@
           <w:sz w:val="18"/>
           <w:szCs w:val="18"/>
         </w:rPr>
-        <w:t>Figure 1. Écran d'accueil, avant toute analyse.</w:t>
+        <w:t>Figure 1. La page de connexion Hemeria.</w:t>
       </w:r>
     </w:p>
     <w:p>
@@ -1184,77 +1242,15 @@
         <w:spacing w:after="120" w:line="276" w:lineRule="auto"/>
       </w:pPr>
       <w:r>
-        <w:t>Sur une installation de développement sans authentification, la bande du haut porte le suffixe « dev » à côté du client et la page de connexion n'apparaît pas.</w:t>
-      </w:r>
-    </w:p>
-    <w:p>
-      <w:pPr>
-        <w:pStyle w:val="Heading1"/>
-        <w:pageBreakBefore/>
-      </w:pPr>
-      <w:bookmarkStart w:id="2" w:name="_Toc243993272"/>
-      <w:r>
-        <w:t>3. Importer un plan</w:t>
-      </w:r>
-      <w:bookmarkEnd w:id="2"/>
-    </w:p>
-    <w:p>
-      <w:pPr>
-        <w:pStyle w:val="ListParagraph"/>
-        <w:numPr>
-          <w:ilvl w:val="0"/>
-          <w:numId w:val="2"/>
-        </w:numPr>
-        <w:spacing w:after="60"/>
-      </w:pPr>
-      <w:r>
-        <w:t xml:space="preserve">Choisissez le plugin dans la liste </w:t>
-      </w:r>
-      <w:r>
-        <w:rPr>
-          <w:b/>
-          <w:bCs/>
-        </w:rPr>
-        <w:t>Plugin client</w:t>
-      </w:r>
-      <w:r>
-        <w:t>. Elle ne propose que les plugins activés pour votre client.</w:t>
-      </w:r>
-    </w:p>
-    <w:p>
-      <w:pPr>
-        <w:pStyle w:val="ListParagraph"/>
-        <w:numPr>
-          <w:ilvl w:val="0"/>
-          <w:numId w:val="2"/>
-        </w:numPr>
-        <w:spacing w:after="60"/>
-      </w:pPr>
-      <w:r>
-        <w:t>Déposez le plan de faisceau dans la première zone en pointillés, ou cliquez dessus pour choisir le fichier. Faites de même avec la nomenclature dans la seconde zone.</w:t>
-      </w:r>
-    </w:p>
-    <w:p>
-      <w:pPr>
-        <w:pStyle w:val="ListParagraph"/>
-        <w:numPr>
-          <w:ilvl w:val="0"/>
-          <w:numId w:val="2"/>
-        </w:numPr>
-        <w:spacing w:after="60"/>
-      </w:pPr>
-      <w:r>
-        <w:t xml:space="preserve">Cliquez sur </w:t>
-      </w:r>
-      <w:r>
-        <w:rPr>
-          <w:b/>
-          <w:bCs/>
-        </w:rPr>
-        <w:t>Analyser</w:t>
-      </w:r>
-      <w:r>
-        <w:t>. Le bouton reste grisé tant que les deux fichiers ne sont pas choisis.</w:t>
+        <w:t>Votre session se renouvelle toute seule pendant que vous travaillez. Si elle prend fin, par exemple après une longue absence, ARIANE vous renvoie vers la page de connexion. Les analyses déjà enregistrées restent dans l'historique.</w:t>
+      </w:r>
+    </w:p>
+    <w:p>
+      <w:pPr>
+        <w:spacing w:after="120" w:line="276" w:lineRule="auto"/>
+      </w:pPr>
+      <w:r>
+        <w:t>L'écran d'accueil comporte quatre zones (figure 2). La bande sombre du haut affiche le nom du plugin et de la référence analysée, votre client et votre identifiant, ainsi que les compteurs d'erreurs et d'alertes une fois une analyse chargée. Le panneau de gauche regroupe l'import, l'historique, la recherche et les exports. Les onglets et la vue active occupent le centre. Le panneau de droite détaille l'élément sélectionné.</w:t>
       </w:r>
     </w:p>
     <w:p>
@@ -1268,10 +1264,10 @@
           <w:noProof/>
         </w:rPr>
         <w:drawing>
-          <wp:inline distT="0" distB="0" distL="0" distR="0" wp14:anchorId="055956E8" wp14:editId="4F67B1EF">
+          <wp:inline distT="0" distB="0" distL="0" distR="0" wp14:anchorId="5DABD693" wp14:editId="2453A457">
             <wp:extent cx="5905500" cy="3505200"/>
             <wp:effectExtent l="0" t="0" r="0" b="0"/>
-            <wp:docPr id="197000439" name="02-import.png" descr="Les deux PDF sont choisis, l'analyse peut commencer." title="Les deux PDF sont choisis, l'analyse peut commencer."/>
+            <wp:docPr id="1445423013" name="01-accueil.png" descr="Écran d'accueil, avant toute analyse." title="Écran d'accueil, avant toute analyse."/>
             <wp:cNvGraphicFramePr>
               <a:graphicFrameLocks xmlns:a="http://schemas.openxmlformats.org/drawingml/2006/main" noChangeAspect="1"/>
             </wp:cNvGraphicFramePr>
@@ -1320,7 +1316,7 @@
           <w:sz w:val="18"/>
           <w:szCs w:val="18"/>
         </w:rPr>
-        <w:t>Figure 2. Les deux PDF sont choisis, l'analyse peut commencer.</w:t>
+        <w:t>Figure 2. Écran d'accueil, avant toute analyse.</w:t>
       </w:r>
     </w:p>
     <w:p>
@@ -1328,35 +1324,77 @@
         <w:spacing w:after="120" w:line="276" w:lineRule="auto"/>
       </w:pPr>
       <w:r>
-        <w:t>L'analyse prend quelques secondes. À la fin, ARIANE ouvre l'onglet Rapport. Si un fichier n'est pas un PDF, ou si le plugin ne l'accepte pas, un message rouge apparaît sous le bouton et rien n'est enregistré.</w:t>
-      </w:r>
-    </w:p>
-    <w:p>
-      <w:pPr>
-        <w:pStyle w:val="Heading2"/>
-      </w:pPr>
-      <w:bookmarkStart w:id="3" w:name="_Toc243993273"/>
-      <w:r>
-        <w:t>3.1 Retrouver une analyse</w:t>
-      </w:r>
-      <w:bookmarkEnd w:id="3"/>
-    </w:p>
-    <w:p>
-      <w:pPr>
-        <w:spacing w:after="120" w:line="276" w:lineRule="auto"/>
-      </w:pPr>
-      <w:r>
-        <w:t xml:space="preserve">Chaque analyse réussie est ajoutée à la liste </w:t>
+        <w:t>Sur une installation de développement sans authentification, la bande du haut porte le suffixe « dev » à côté du client et la page de connexion n'apparaît pas.</w:t>
+      </w:r>
+    </w:p>
+    <w:p>
+      <w:pPr>
+        <w:pStyle w:val="Heading1"/>
+        <w:pageBreakBefore/>
+      </w:pPr>
+      <w:bookmarkStart w:id="2" w:name="_Toc244015085"/>
+      <w:r>
+        <w:t>3. Importer un plan</w:t>
+      </w:r>
+      <w:bookmarkEnd w:id="2"/>
+    </w:p>
+    <w:p>
+      <w:pPr>
+        <w:pStyle w:val="ListParagraph"/>
+        <w:numPr>
+          <w:ilvl w:val="0"/>
+          <w:numId w:val="2"/>
+        </w:numPr>
+        <w:spacing w:after="60"/>
+      </w:pPr>
+      <w:r>
+        <w:t xml:space="preserve">Choisissez le plugin dans la liste </w:t>
       </w:r>
       <w:r>
         <w:rPr>
           <w:b/>
           <w:bCs/>
         </w:rPr>
-        <w:t>Analyses précédentes</w:t>
-      </w:r>
-      <w:r>
-        <w:t xml:space="preserve"> du panneau de gauche, avec sa date, son nombre d'erreurs et son nombre d'alertes. Un clic rouvre l'analyse sans relire les PDF. La croix à droite de la ligne la supprime.</w:t>
+        <w:t>Plugin client</w:t>
+      </w:r>
+      <w:r>
+        <w:t>. Elle ne propose que les plugins activés pour votre client.</w:t>
+      </w:r>
+    </w:p>
+    <w:p>
+      <w:pPr>
+        <w:pStyle w:val="ListParagraph"/>
+        <w:numPr>
+          <w:ilvl w:val="0"/>
+          <w:numId w:val="2"/>
+        </w:numPr>
+        <w:spacing w:after="60"/>
+      </w:pPr>
+      <w:r>
+        <w:t>Déposez le plan de faisceau dans la première zone en pointillés, ou cliquez dessus pour choisir le fichier. Faites de même avec la nomenclature dans la seconde zone.</w:t>
+      </w:r>
+    </w:p>
+    <w:p>
+      <w:pPr>
+        <w:pStyle w:val="ListParagraph"/>
+        <w:numPr>
+          <w:ilvl w:val="0"/>
+          <w:numId w:val="2"/>
+        </w:numPr>
+        <w:spacing w:after="60"/>
+      </w:pPr>
+      <w:r>
+        <w:t xml:space="preserve">Cliquez sur </w:t>
+      </w:r>
+      <w:r>
+        <w:rPr>
+          <w:b/>
+          <w:bCs/>
+        </w:rPr>
+        <w:t>Analyser</w:t>
+      </w:r>
+      <w:r>
+        <w:t>. Le bouton reste grisé tant que les deux fichiers ne sont pas choisis.</w:t>
       </w:r>
     </w:p>
     <w:p>
@@ -1370,10 +1408,10 @@
           <w:noProof/>
         </w:rPr>
         <w:drawing>
-          <wp:inline distT="0" distB="0" distL="0" distR="0" wp14:anchorId="58220BBE" wp14:editId="2D2963C6">
-            <wp:extent cx="2857500" cy="4762500"/>
+          <wp:inline distT="0" distB="0" distL="0" distR="0" wp14:anchorId="37D45667" wp14:editId="68037B1E">
+            <wp:extent cx="5905500" cy="3505200"/>
             <wp:effectExtent l="0" t="0" r="0" b="0"/>
-            <wp:docPr id="1106363335" name="11-historique.png" descr="L'historique des analyses du client." title="L'historique des analyses du client."/>
+            <wp:docPr id="1485948824" name="02-import.png" descr="Les deux PDF sont choisis, l'analyse peut commencer." title="Les deux PDF sont choisis, l'analyse peut commencer."/>
             <wp:cNvGraphicFramePr>
               <a:graphicFrameLocks xmlns:a="http://schemas.openxmlformats.org/drawingml/2006/main" noChangeAspect="1"/>
             </wp:cNvGraphicFramePr>
@@ -1396,7 +1434,7 @@
                   <pic:spPr bwMode="auto">
                     <a:xfrm>
                       <a:off x="0" y="0"/>
-                      <a:ext cx="2857500" cy="4762500"/>
+                      <a:ext cx="5905500" cy="3505200"/>
                     </a:xfrm>
                     <a:prstGeom prst="rect">
                       <a:avLst/>
@@ -1422,44 +1460,43 @@
           <w:sz w:val="18"/>
           <w:szCs w:val="18"/>
         </w:rPr>
-        <w:t>Figure 3. L'historique des analyses du client.</w:t>
-      </w:r>
-    </w:p>
-    <w:p>
-      <w:pPr>
-        <w:pStyle w:val="Heading1"/>
-        <w:pageBreakBefore/>
-      </w:pPr>
-      <w:bookmarkStart w:id="4" w:name="_Toc243993274"/>
-      <w:r>
-        <w:t>4. Lire le résultat</w:t>
-      </w:r>
-      <w:bookmarkEnd w:id="4"/>
+        <w:t>Figure 3. Les deux PDF sont choisis, l'analyse peut commencer.</w:t>
+      </w:r>
     </w:p>
     <w:p>
       <w:pPr>
         <w:spacing w:after="120" w:line="276" w:lineRule="auto"/>
       </w:pPr>
       <w:r>
-        <w:t>Les compteurs rouge et orange en haut à droite résument l'analyse. Dans l'exemple, ARIANE signale 4 erreurs et 15 alertes. Quatre onglets présentent le même résultat sous des angles différents. Une sélection faite dans un onglet reste active dans les autres : le fil choisi dans la vue Connecteurs se retrouve dans le panneau de droite.</w:t>
+        <w:t>L'analyse prend quelques secondes. À la fin, ARIANE ouvre l'onglet Rapport. Si un fichier n'est pas un PDF, ou si le plugin ne l'accepte pas, un message rouge apparaît sous le bouton et rien n'est enregistré.</w:t>
       </w:r>
     </w:p>
     <w:p>
       <w:pPr>
         <w:pStyle w:val="Heading2"/>
       </w:pPr>
-      <w:bookmarkStart w:id="5" w:name="_Toc243993275"/>
-      <w:r>
-        <w:t>4.1 Rapport</w:t>
-      </w:r>
-      <w:bookmarkEnd w:id="5"/>
+      <w:bookmarkStart w:id="3" w:name="_Toc244015086"/>
+      <w:r>
+        <w:t>3.1 Retrouver une analyse</w:t>
+      </w:r>
+      <w:bookmarkEnd w:id="3"/>
     </w:p>
     <w:p>
       <w:pPr>
         <w:spacing w:after="120" w:line="276" w:lineRule="auto"/>
       </w:pPr>
       <w:r>
-        <w:t>L'onglet Rapport s'ouvre en premier. La rangée de tuiles donne les quantités reconnues. L'exemple compte 8 connecteurs, 96 conducteurs regroupés en 48 paires, 48 paires routées dans le faisceau, 122 contacts pin et 114 contacts socket.</w:t>
+        <w:t xml:space="preserve">Chaque analyse réussie est ajoutée à la liste </w:t>
+      </w:r>
+      <w:r>
+        <w:rPr>
+          <w:b/>
+          <w:bCs/>
+        </w:rPr>
+        <w:t>Analyses précédentes</w:t>
+      </w:r>
+      <w:r>
+        <w:t xml:space="preserve"> du panneau de gauche, avec sa date, son nombre d'erreurs et son nombre d'alertes. Un clic rouvre l'analyse sans relire les PDF. La croix à droite de la ligne la supprime.</w:t>
       </w:r>
     </w:p>
     <w:p>
@@ -1473,10 +1510,10 @@
           <w:noProof/>
         </w:rPr>
         <w:drawing>
-          <wp:inline distT="0" distB="0" distL="0" distR="0" wp14:anchorId="27E55E0D" wp14:editId="2555D844">
-            <wp:extent cx="5905500" cy="3505200"/>
+          <wp:inline distT="0" distB="0" distL="0" distR="0" wp14:anchorId="68971599" wp14:editId="07247769">
+            <wp:extent cx="2857500" cy="4762500"/>
             <wp:effectExtent l="0" t="0" r="0" b="0"/>
-            <wp:docPr id="1875948904" name="03-rapport.png" descr="Le rapport : quantités reconnues, puis liste des contrôles." title="Le rapport : quantités reconnues, puis liste des contrôles."/>
+            <wp:docPr id="1402734263" name="11-historique.png" descr="L'historique des analyses du client." title="L'historique des analyses du client."/>
             <wp:cNvGraphicFramePr>
               <a:graphicFrameLocks xmlns:a="http://schemas.openxmlformats.org/drawingml/2006/main" noChangeAspect="1"/>
             </wp:cNvGraphicFramePr>
@@ -1499,7 +1536,7 @@
                   <pic:spPr bwMode="auto">
                     <a:xfrm>
                       <a:off x="0" y="0"/>
-                      <a:ext cx="5905500" cy="3505200"/>
+                      <a:ext cx="2857500" cy="4762500"/>
                     </a:xfrm>
                     <a:prstGeom prst="rect">
                       <a:avLst/>
@@ -1525,81 +1562,44 @@
           <w:sz w:val="18"/>
           <w:szCs w:val="18"/>
         </w:rPr>
-        <w:t>Figure 4. Le rapport : quantités reconnues, puis liste des contrôles.</w:t>
-      </w:r>
+        <w:t>Figure 4. L'historique des analyses du client.</w:t>
+      </w:r>
+    </w:p>
+    <w:p>
+      <w:pPr>
+        <w:pStyle w:val="Heading1"/>
+        <w:pageBreakBefore/>
+      </w:pPr>
+      <w:bookmarkStart w:id="4" w:name="_Toc244015087"/>
+      <w:r>
+        <w:t>4. Lire le résultat</w:t>
+      </w:r>
+      <w:bookmarkEnd w:id="4"/>
     </w:p>
     <w:p>
       <w:pPr>
         <w:spacing w:after="120" w:line="276" w:lineRule="auto"/>
       </w:pPr>
       <w:r>
-        <w:t xml:space="preserve">Sous les tuiles, trois boutons </w:t>
-      </w:r>
-      <w:r>
-        <w:rPr>
-          <w:b/>
-          <w:bCs/>
-        </w:rPr>
-        <w:t>Erreur</w:t>
-      </w:r>
-      <w:r>
-        <w:t xml:space="preserve">, </w:t>
-      </w:r>
-      <w:r>
-        <w:rPr>
-          <w:b/>
-          <w:bCs/>
-        </w:rPr>
-        <w:t>Alerte</w:t>
-      </w:r>
-      <w:r>
-        <w:t xml:space="preserve"> et </w:t>
-      </w:r>
-      <w:r>
-        <w:rPr>
-          <w:b/>
-          <w:bCs/>
-        </w:rPr>
-        <w:t>Info</w:t>
-      </w:r>
-      <w:r>
-        <w:t xml:space="preserve"> filtrent la liste. Une erreur est une incohérence entre les documents. Une alerte demande une vérification mais ne contredit rien de façon certaine. Une info signale une donnée manquante sans conséquence sur les connexions, par exemple une quantité encore à définir dans la nomenclature.</w:t>
-      </w:r>
+        <w:t>Les compteurs rouge et orange en haut à droite résument l'analyse. Dans l'exemple, ARIANE signale 4 erreurs et 15 alertes. Quatre onglets présentent le même résultat sous des angles différents. Une sélection faite dans un onglet reste active dans les autres : le fil choisi dans la vue Connecteurs se retrouve dans le panneau de droite.</w:t>
+      </w:r>
+    </w:p>
+    <w:p>
+      <w:pPr>
+        <w:pStyle w:val="Heading2"/>
+      </w:pPr>
+      <w:bookmarkStart w:id="5" w:name="_Toc244015088"/>
+      <w:r>
+        <w:t>4.1 Rapport</w:t>
+      </w:r>
+      <w:bookmarkEnd w:id="5"/>
     </w:p>
     <w:p>
       <w:pPr>
         <w:spacing w:after="120" w:line="276" w:lineRule="auto"/>
       </w:pPr>
       <w:r>
-        <w:t>Un clic sur une ligne ouvre la vue concernée avec la pin ou le segment sélectionné (figure 5).</w:t>
-      </w:r>
-    </w:p>
-    <w:p>
-      <w:pPr>
-        <w:pStyle w:val="Heading2"/>
-      </w:pPr>
-      <w:bookmarkStart w:id="6" w:name="_Toc243993276"/>
-      <w:r>
-        <w:t>4.2 Connecteurs</w:t>
-      </w:r>
-      <w:bookmarkEnd w:id="6"/>
-    </w:p>
-    <w:p>
-      <w:pPr>
-        <w:spacing w:after="120" w:line="276" w:lineRule="auto"/>
-      </w:pPr>
-      <w:r>
-        <w:t xml:space="preserve">Chaque connecteur du plan est un bloc : son repère, sa référence et ses pins disposées en rangées. Un badge </w:t>
-      </w:r>
-      <w:r>
-        <w:rPr>
-          <w:b/>
-          <w:bCs/>
-        </w:rPr>
-        <w:t>n à vérifier</w:t>
-      </w:r>
-      <w:r>
-        <w:t xml:space="preserve"> apparaît dans l'en-tête du bloc quand une pin pose problème, rouge s'il s'agit d'une erreur, orange s'il ne s'agit que d'une alerte. Les pins en erreur sont entourées de rouge et portent un petit carré rouge.</w:t>
+        <w:t>L'onglet Rapport s'ouvre en premier. La rangée de tuiles donne les quantités reconnues. L'exemple compte 8 connecteurs, 96 conducteurs regroupés en 48 paires, 48 paires routées dans le faisceau, 122 contacts pin et 114 contacts socket.</w:t>
       </w:r>
     </w:p>
     <w:p>
@@ -1613,10 +1613,10 @@
           <w:noProof/>
         </w:rPr>
         <w:drawing>
-          <wp:inline distT="0" distB="0" distL="0" distR="0" wp14:anchorId="69565D60" wp14:editId="31492051">
+          <wp:inline distT="0" distB="0" distL="0" distR="0" wp14:anchorId="1D05AF0B" wp14:editId="7E18FFCD">
             <wp:extent cx="5905500" cy="3505200"/>
             <wp:effectExtent l="0" t="0" r="0" b="0"/>
-            <wp:docPr id="808045324" name="08-erreur.png" descr="Pin W du connecteur INIT B P1, ouverte depuis le rapport." title="Pin W du connecteur INIT B P1, ouverte depuis le rapport."/>
+            <wp:docPr id="2058952130" name="03-rapport.png" descr="Le rapport : quantités reconnues, puis liste des contrôles." title="Le rapport : quantités reconnues, puis liste des contrôles."/>
             <wp:cNvGraphicFramePr>
               <a:graphicFrameLocks xmlns:a="http://schemas.openxmlformats.org/drawingml/2006/main" noChangeAspect="1"/>
             </wp:cNvGraphicFramePr>
@@ -1665,7 +1665,7 @@
           <w:sz w:val="18"/>
           <w:szCs w:val="18"/>
         </w:rPr>
-        <w:t>Figure 5. Pin W du connecteur INIT B P1, ouverte depuis le rapport.</w:t>
+        <w:t>Figure 5. Le rapport : quantités reconnues, puis liste des contrôles.</w:t>
       </w:r>
     </w:p>
     <w:p>
@@ -1673,33 +1673,73 @@
         <w:spacing w:after="120" w:line="276" w:lineRule="auto"/>
       </w:pPr>
       <w:r>
-        <w:t>Cliquer une pin affiche à droite le fil qui l'occupe : signal, polarité, type de câble, départ, arrivée, paire associée et chemin dans le faisceau. Chaque ligne du chemin donne le segment, son diamètre en millimètres et le repère de nomenclature. Quand une pin porte plusieurs fils, un encadré orange les liste et un clic sur l'un d'eux le sélectionne. Si la pin est en erreur, un encadré rouge reprend les lignes du rapport qui la concernent.</w:t>
-      </w:r>
-    </w:p>
-    <w:p>
-      <w:pPr>
-        <w:spacing w:after="120" w:line="276" w:lineRule="auto"/>
-      </w:pPr>
-      <w:r>
-        <w:t>Sous chaque bloc, ARIANE indique le nombre de places vides du connecteur. La majuscule et la minuscule d'une lettre désignent deux pins différentes : c n'est pas C, et W n'est pas w.</w:t>
-      </w:r>
-    </w:p>
-    <w:p>
-      <w:pPr>
-        <w:spacing w:after="120" w:line="276" w:lineRule="auto"/>
-      </w:pPr>
-      <w:r>
-        <w:t xml:space="preserve">Le champ </w:t>
+        <w:t xml:space="preserve">Sous les tuiles, trois boutons </w:t>
       </w:r>
       <w:r>
         <w:rPr>
           <w:b/>
           <w:bCs/>
         </w:rPr>
-        <w:t>Recherche</w:t>
-      </w:r>
-      <w:r>
-        <w:t xml:space="preserve"> du panneau de gauche accepte un numéro de fil (907-01+), un nom de signal ou une pin. Le premier fil trouvé est sélectionné (figure 6).</w:t>
+        <w:t>Erreur</w:t>
+      </w:r>
+      <w:r>
+        <w:t xml:space="preserve">, </w:t>
+      </w:r>
+      <w:r>
+        <w:rPr>
+          <w:b/>
+          <w:bCs/>
+        </w:rPr>
+        <w:t>Alerte</w:t>
+      </w:r>
+      <w:r>
+        <w:t xml:space="preserve"> et </w:t>
+      </w:r>
+      <w:r>
+        <w:rPr>
+          <w:b/>
+          <w:bCs/>
+        </w:rPr>
+        <w:t>Info</w:t>
+      </w:r>
+      <w:r>
+        <w:t xml:space="preserve"> filtrent la liste. Une erreur est une incohérence entre les documents. Une alerte demande une vérification mais ne contredit rien de façon certaine. Une info signale une donnée manquante sans conséquence sur les connexions, par exemple une quantité encore à définir dans la nomenclature.</w:t>
+      </w:r>
+    </w:p>
+    <w:p>
+      <w:pPr>
+        <w:spacing w:after="120" w:line="276" w:lineRule="auto"/>
+      </w:pPr>
+      <w:r>
+        <w:t>Un clic sur une ligne ouvre la vue concernée avec la pin ou le segment sélectionné (figure 6).</w:t>
+      </w:r>
+    </w:p>
+    <w:p>
+      <w:pPr>
+        <w:pStyle w:val="Heading2"/>
+      </w:pPr>
+      <w:bookmarkStart w:id="6" w:name="_Toc244015089"/>
+      <w:r>
+        <w:t>4.2 Connecteurs</w:t>
+      </w:r>
+      <w:bookmarkEnd w:id="6"/>
+    </w:p>
+    <w:p>
+      <w:pPr>
+        <w:spacing w:after="120" w:line="276" w:lineRule="auto"/>
+      </w:pPr>
+      <w:r>
+        <w:t xml:space="preserve">Chaque connecteur du plan est un bloc : son repère, sa référence et ses pins disposées en rangées. Un badge </w:t>
+      </w:r>
+      <w:r>
+        <w:rPr>
+          <w:b/>
+          <w:bCs/>
+        </w:rPr>
+        <w:t>n à vérifier</w:t>
+      </w:r>
+      <w:r>
+        <w:t xml:space="preserve"> apparaît dans l'en-tête du bloc quand une pin pose problème, rouge s'il s'agit d'une erreur, orange s'il ne s'agit que d'une alerte. Les pins en erreur sont entourées de rouge et portent un petit carré rouge.</w:t>
       </w:r>
     </w:p>
     <w:p>
@@ -1713,10 +1753,10 @@
           <w:noProof/>
         </w:rPr>
         <w:drawing>
-          <wp:inline distT="0" distB="0" distL="0" distR="0" wp14:anchorId="5D69813D" wp14:editId="338FFBBE">
+          <wp:inline distT="0" distB="0" distL="0" distR="0" wp14:anchorId="201A4E44" wp14:editId="2C3944AC">
             <wp:extent cx="5905500" cy="3505200"/>
             <wp:effectExtent l="0" t="0" r="0" b="0"/>
-            <wp:docPr id="1606573621" name="09-recherche.png" descr="Recherche du fil 907-01+ : le chemin et les deux pins sont mis en évidence." title="Recherche du fil 907-01+ : le chemin et les deux pins sont mis en évidence."/>
+            <wp:docPr id="979838082" name="08-erreur.png" descr="Pin W du connecteur INIT B P1, ouverte depuis le rapport." title="Pin W du connecteur INIT B P1, ouverte depuis le rapport."/>
             <wp:cNvGraphicFramePr>
               <a:graphicFrameLocks xmlns:a="http://schemas.openxmlformats.org/drawingml/2006/main" noChangeAspect="1"/>
             </wp:cNvGraphicFramePr>
@@ -1765,25 +1805,23 @@
           <w:sz w:val="18"/>
           <w:szCs w:val="18"/>
         </w:rPr>
-        <w:t>Figure 6. Recherche du fil 907-01+ : le chemin et les deux pins sont mis en évidence.</w:t>
-      </w:r>
-    </w:p>
-    <w:p>
-      <w:pPr>
-        <w:pStyle w:val="Heading2"/>
-      </w:pPr>
-      <w:bookmarkStart w:id="7" w:name="_Toc243993277"/>
-      <w:r>
-        <w:t>4.3 Faisceau</w:t>
-      </w:r>
-      <w:bookmarkEnd w:id="7"/>
+        <w:t>Figure 6. Pin W du connecteur INIT B P1, ouverte depuis le rapport.</w:t>
+      </w:r>
     </w:p>
     <w:p>
       <w:pPr>
         <w:spacing w:after="120" w:line="276" w:lineRule="auto"/>
       </w:pPr>
       <w:r>
-        <w:t>La vue Faisceau redessine la topologie de la feuille 1 du plan. Les six connecteurs S/C partent du haut et rejoignent les deux connecteurs INIT en bas. Les numéros rouges sont les nœuds du plan. Chaque segment porte son diamètre en millimètres et le repère de la nomenclature, par exemple « Ø12.5 · 09 ».</w:t>
+        <w:t>Cliquer une pin affiche à droite le fil qui l'occupe : signal, polarité, type de câble, départ, arrivée, paire associée et chemin dans le faisceau. Chaque ligne du chemin donne le segment, son diamètre en millimètres et le repère de nomenclature. Quand une pin porte plusieurs fils, un encadré orange les liste et un clic sur l'un d'eux le sélectionne. Si la pin est en erreur, un encadré rouge reprend les lignes du rapport qui la concernent.</w:t>
+      </w:r>
+    </w:p>
+    <w:p>
+      <w:pPr>
+        <w:spacing w:after="120" w:line="276" w:lineRule="auto"/>
+      </w:pPr>
+      <w:r>
+        <w:t>Sous chaque bloc, ARIANE indique le nombre de places vides du connecteur. Quand le plugin connaît la disposition des contacts de l'insert, les lettres des places vides s'affichent aussi dans des cases en pointillés (figure 7). Sur l'exemple, ce sont les pins C, F et M de chaque bloc S/C. Pour les connecteurs INIT, dont la disposition n'est pas connue du plugin, seul le nombre est indiqué.</w:t>
       </w:r>
     </w:p>
     <w:p>
@@ -1797,10 +1835,10 @@
           <w:noProof/>
         </w:rPr>
         <w:drawing>
-          <wp:inline distT="0" distB="0" distL="0" distR="0" wp14:anchorId="35B98828" wp14:editId="29A94218">
-            <wp:extent cx="5905500" cy="3505200"/>
+          <wp:inline distT="0" distB="0" distL="0" distR="0" wp14:anchorId="2C0C3647" wp14:editId="6B8B19AE">
+            <wp:extent cx="3810000" cy="1504950"/>
             <wp:effectExtent l="0" t="0" r="0" b="0"/>
-            <wp:docPr id="1217934438" name="04-faisceau.png" descr="Topologie du faisceau. Les pastilles sur les connecteurs comptent les points à vérifier." title="Topologie du faisceau. Les pastilles sur les connecteurs comptent les points à vérifier."/>
+            <wp:docPr id="1165066863" name="12-places-vides.png" descr="Un bloc S/C : seize pins utilisées, trois places vides (C, F et M)." title="Un bloc S/C : seize pins utilisées, trois places vides (C, F et M)."/>
             <wp:cNvGraphicFramePr>
               <a:graphicFrameLocks xmlns:a="http://schemas.openxmlformats.org/drawingml/2006/main" noChangeAspect="1"/>
             </wp:cNvGraphicFramePr>
@@ -1823,7 +1861,7 @@
                   <pic:spPr bwMode="auto">
                     <a:xfrm>
                       <a:off x="0" y="0"/>
-                      <a:ext cx="5905500" cy="3505200"/>
+                      <a:ext cx="3810000" cy="1504950"/>
                     </a:xfrm>
                     <a:prstGeom prst="rect">
                       <a:avLst/>
@@ -1849,7 +1887,7 @@
           <w:sz w:val="18"/>
           <w:szCs w:val="18"/>
         </w:rPr>
-        <w:t>Figure 7. Topologie du faisceau. Les pastilles sur les connecteurs comptent les points à vérifier.</w:t>
+        <w:t>Figure 7. Un bloc S/C : seize pins utilisées, trois places vides (C, F et M).</w:t>
       </w:r>
     </w:p>
     <w:p>
@@ -1857,63 +1895,25 @@
         <w:spacing w:after="120" w:line="276" w:lineRule="auto"/>
       </w:pPr>
       <w:r>
-        <w:t xml:space="preserve">Quand un fil est sélectionné, son chemin s'affiche en jaune. Un segment dont le diamètre n'a pas pu être lu porte « Ø ? » avec un symbole d'alerte. La case </w:t>
+        <w:t>La majuscule et la minuscule d'une lettre désignent deux pins différentes : c n'est pas C, et W n'est pas w.</w:t>
+      </w:r>
+    </w:p>
+    <w:p>
+      <w:pPr>
+        <w:spacing w:after="120" w:line="276" w:lineRule="auto"/>
+      </w:pPr>
+      <w:r>
+        <w:t xml:space="preserve">Le champ </w:t>
       </w:r>
       <w:r>
         <w:rPr>
           <w:b/>
           <w:bCs/>
         </w:rPr>
-        <w:t>Ø / repères</w:t>
-      </w:r>
-      <w:r>
-        <w:t xml:space="preserve"> masque ou affiche ces étiquettes.</w:t>
-      </w:r>
-    </w:p>
-    <w:p>
-      <w:pPr>
-        <w:spacing w:after="120" w:line="276" w:lineRule="auto"/>
-      </w:pPr>
-      <w:r>
-        <w:t xml:space="preserve">La barre d'outils règle le zoom : les boutons moins et plus, </w:t>
-      </w:r>
-      <w:r>
-        <w:rPr>
-          <w:b/>
-          <w:bCs/>
-        </w:rPr>
-        <w:t>Ajuster</w:t>
-      </w:r>
-      <w:r>
-        <w:t xml:space="preserve"> pour tenir dans la fenêtre, </w:t>
-      </w:r>
-      <w:r>
-        <w:rPr>
-          <w:b/>
-          <w:bCs/>
-        </w:rPr>
-        <w:t>100 %</w:t>
-      </w:r>
-      <w:r>
-        <w:t xml:space="preserve"> pour la taille réelle. La molette de la souris avec la touche Ctrl zoome aussi, et les barres de défilement déplacent la vue.</w:t>
-      </w:r>
-    </w:p>
-    <w:p>
-      <w:pPr>
-        <w:pStyle w:val="Heading2"/>
-      </w:pPr>
-      <w:bookmarkStart w:id="8" w:name="_Toc243993278"/>
-      <w:r>
-        <w:t>4.4 Câblage</w:t>
-      </w:r>
-      <w:bookmarkEnd w:id="8"/>
-    </w:p>
-    <w:p>
-      <w:pPr>
-        <w:spacing w:after="120" w:line="276" w:lineRule="auto"/>
-      </w:pPr>
-      <w:r>
-        <w:t>La vue Câblage reproduit la disposition de la feuille 2 du plan : les blocs S/C à gauche, les blocs INIT à droite, avec les traits d'origine redessinés par ARIANE. Les cadres rouges et orange désignent les blocs qui contiennent des erreurs ou des alertes. La feuille entière est visible, cartouche compris.</w:t>
+        <w:t>Recherche</w:t>
+      </w:r>
+      <w:r>
+        <w:t xml:space="preserve"> du panneau de gauche accepte un numéro de fil (907-01+), un nom de signal ou une pin. Le premier fil trouvé est sélectionné (figure 8).</w:t>
       </w:r>
     </w:p>
     <w:p>
@@ -1927,10 +1927,10 @@
           <w:noProof/>
         </w:rPr>
         <w:drawing>
-          <wp:inline distT="0" distB="0" distL="0" distR="0" wp14:anchorId="5D596B35" wp14:editId="4A72BDF3">
+          <wp:inline distT="0" distB="0" distL="0" distR="0" wp14:anchorId="52652AE3" wp14:editId="0E2B17EA">
             <wp:extent cx="5905500" cy="3505200"/>
             <wp:effectExtent l="0" t="0" r="0" b="0"/>
-            <wp:docPr id="2005201892" name="06-cablage.png" descr="Le câblage, tel que la feuille 2 le présente." title="Le câblage, tel que la feuille 2 le présente."/>
+            <wp:docPr id="2068054800" name="09-recherche.png" descr="Recherche du fil 907-01+ : le chemin et les deux pins sont mis en évidence." title="Recherche du fil 907-01+ : le chemin et les deux pins sont mis en évidence."/>
             <wp:cNvGraphicFramePr>
               <a:graphicFrameLocks xmlns:a="http://schemas.openxmlformats.org/drawingml/2006/main" noChangeAspect="1"/>
             </wp:cNvGraphicFramePr>
@@ -1979,7 +1979,382 @@
           <w:sz w:val="18"/>
           <w:szCs w:val="18"/>
         </w:rPr>
-        <w:t>Figure 8. Le câblage, tel que la feuille 2 le présente.</w:t>
+        <w:t>Figure 8. Recherche du fil 907-01+ : le chemin et les deux pins sont mis en évidence.</w:t>
+      </w:r>
+    </w:p>
+    <w:p>
+      <w:pPr>
+        <w:pStyle w:val="Heading2"/>
+      </w:pPr>
+      <w:bookmarkStart w:id="7" w:name="_Toc244015090"/>
+      <w:r>
+        <w:t>4.3 Faisceau</w:t>
+      </w:r>
+      <w:bookmarkEnd w:id="7"/>
+    </w:p>
+    <w:p>
+      <w:pPr>
+        <w:spacing w:after="120" w:line="276" w:lineRule="auto"/>
+      </w:pPr>
+      <w:r>
+        <w:t>La vue Faisceau redessine la topologie de la feuille 1 du plan. Les six connecteurs S/C partent du haut et rejoignent les deux connecteurs INIT en bas. Les numéros rouges sont les nœuds du plan. Chaque segment porte son diamètre en millimètres et le repère de la nomenclature, par exemple « Ø12.5 · 09 ».</w:t>
+      </w:r>
+    </w:p>
+    <w:p>
+      <w:pPr>
+        <w:keepNext/>
+        <w:spacing w:before="120" w:after="60"/>
+        <w:jc w:val="center"/>
+      </w:pPr>
+      <w:r>
+        <w:rPr>
+          <w:noProof/>
+        </w:rPr>
+        <w:drawing>
+          <wp:inline distT="0" distB="0" distL="0" distR="0" wp14:anchorId="2641307F" wp14:editId="2DEE2C5D">
+            <wp:extent cx="5905500" cy="3505200"/>
+            <wp:effectExtent l="0" t="0" r="0" b="0"/>
+            <wp:docPr id="2137939371" name="04-faisceau.png" descr="Topologie du faisceau. Les pastilles sur les connecteurs comptent les points à vérifier." title="Topologie du faisceau. Les pastilles sur les connecteurs comptent les points à vérifier."/>
+            <wp:cNvGraphicFramePr>
+              <a:graphicFrameLocks xmlns:a="http://schemas.openxmlformats.org/drawingml/2006/main" noChangeAspect="1"/>
+            </wp:cNvGraphicFramePr>
+            <a:graphic xmlns:a="http://schemas.openxmlformats.org/drawingml/2006/main">
+              <a:graphicData uri="http://schemas.openxmlformats.org/drawingml/2006/picture">
+                <pic:pic xmlns:pic="http://schemas.openxmlformats.org/drawingml/2006/picture">
+                  <pic:nvPicPr>
+                    <pic:cNvPr id="0" name=""/>
+                    <pic:cNvPicPr>
+                      <a:picLocks noChangeAspect="1" noChangeArrowheads="1"/>
+                    </pic:cNvPicPr>
+                  </pic:nvPicPr>
+                  <pic:blipFill>
+                    <a:blip r:embed="rId15"/>
+                    <a:srcRect/>
+                    <a:stretch>
+                      <a:fillRect/>
+                    </a:stretch>
+                  </pic:blipFill>
+                  <pic:spPr bwMode="auto">
+                    <a:xfrm>
+                      <a:off x="0" y="0"/>
+                      <a:ext cx="5905500" cy="3505200"/>
+                    </a:xfrm>
+                    <a:prstGeom prst="rect">
+                      <a:avLst/>
+                    </a:prstGeom>
+                  </pic:spPr>
+                </pic:pic>
+              </a:graphicData>
+            </a:graphic>
+          </wp:inline>
+        </w:drawing>
+      </w:r>
+    </w:p>
+    <w:p>
+      <w:pPr>
+        <w:spacing w:after="200"/>
+        <w:jc w:val="center"/>
+      </w:pPr>
+      <w:r>
+        <w:rPr>
+          <w:i/>
+          <w:iCs/>
+          <w:color w:val="55606B"/>
+          <w:sz w:val="18"/>
+          <w:szCs w:val="18"/>
+        </w:rPr>
+        <w:t>Figure 9. Topologie du faisceau. Les pastilles sur les connecteurs comptent les points à vérifier.</w:t>
+      </w:r>
+    </w:p>
+    <w:p>
+      <w:pPr>
+        <w:spacing w:after="120" w:line="276" w:lineRule="auto"/>
+      </w:pPr>
+      <w:r>
+        <w:t xml:space="preserve">Quand un fil est sélectionné, son chemin s'affiche en jaune. Un segment dont le diamètre n'a pas pu être lu porte « Ø ? » avec un symbole d'alerte. La case </w:t>
+      </w:r>
+      <w:r>
+        <w:rPr>
+          <w:b/>
+          <w:bCs/>
+        </w:rPr>
+        <w:t>Ø / repères</w:t>
+      </w:r>
+      <w:r>
+        <w:t xml:space="preserve"> masque ou affiche ces étiquettes.</w:t>
+      </w:r>
+    </w:p>
+    <w:p>
+      <w:pPr>
+        <w:spacing w:after="120" w:line="276" w:lineRule="auto"/>
+      </w:pPr>
+      <w:r>
+        <w:t xml:space="preserve">La barre d'outils règle le zoom : les boutons moins et plus, </w:t>
+      </w:r>
+      <w:r>
+        <w:rPr>
+          <w:b/>
+          <w:bCs/>
+        </w:rPr>
+        <w:t>Ajuster</w:t>
+      </w:r>
+      <w:r>
+        <w:t xml:space="preserve"> pour tenir dans la fenêtre, </w:t>
+      </w:r>
+      <w:r>
+        <w:rPr>
+          <w:b/>
+          <w:bCs/>
+        </w:rPr>
+        <w:t>100 %</w:t>
+      </w:r>
+      <w:r>
+        <w:t xml:space="preserve"> pour la taille réelle. La molette de la souris avec la touche Ctrl zoome aussi, et les barres de défilement déplacent la vue.</w:t>
+      </w:r>
+    </w:p>
+    <w:p>
+      <w:pPr>
+        <w:pStyle w:val="Heading2"/>
+      </w:pPr>
+      <w:bookmarkStart w:id="8" w:name="_Toc244015091"/>
+      <w:r>
+        <w:t>4.4 Câblage</w:t>
+      </w:r>
+      <w:bookmarkEnd w:id="8"/>
+    </w:p>
+    <w:p>
+      <w:pPr>
+        <w:spacing w:after="120" w:line="276" w:lineRule="auto"/>
+      </w:pPr>
+      <w:r>
+        <w:t>La vue Câblage reproduit la disposition de la feuille 2 du plan : les blocs S/C à gauche, les blocs INIT à droite, avec les traits d'origine redessinés par ARIANE. Les cadres rouges et orange désignent les blocs qui contiennent des erreurs ou des alertes. Le cadre et le cartouche de la feuille ne sont pas repris, et le zoom d'ajustement se cale sur les tableaux et leurs traits.</w:t>
+      </w:r>
+    </w:p>
+    <w:p>
+      <w:pPr>
+        <w:keepNext/>
+        <w:spacing w:before="120" w:after="60"/>
+        <w:jc w:val="center"/>
+      </w:pPr>
+      <w:r>
+        <w:rPr>
+          <w:noProof/>
+        </w:rPr>
+        <w:drawing>
+          <wp:inline distT="0" distB="0" distL="0" distR="0" wp14:anchorId="2528B66A" wp14:editId="25EAD70D">
+            <wp:extent cx="5905500" cy="3505200"/>
+            <wp:effectExtent l="0" t="0" r="0" b="0"/>
+            <wp:docPr id="601289534" name="06-cablage.png" descr="Le câblage, tel que la feuille 2 le présente." title="Le câblage, tel que la feuille 2 le présente."/>
+            <wp:cNvGraphicFramePr>
+              <a:graphicFrameLocks xmlns:a="http://schemas.openxmlformats.org/drawingml/2006/main" noChangeAspect="1"/>
+            </wp:cNvGraphicFramePr>
+            <a:graphic xmlns:a="http://schemas.openxmlformats.org/drawingml/2006/main">
+              <a:graphicData uri="http://schemas.openxmlformats.org/drawingml/2006/picture">
+                <pic:pic xmlns:pic="http://schemas.openxmlformats.org/drawingml/2006/picture">
+                  <pic:nvPicPr>
+                    <pic:cNvPr id="0" name=""/>
+                    <pic:cNvPicPr>
+                      <a:picLocks noChangeAspect="1" noChangeArrowheads="1"/>
+                    </pic:cNvPicPr>
+                  </pic:nvPicPr>
+                  <pic:blipFill>
+                    <a:blip r:embed="rId16"/>
+                    <a:srcRect/>
+                    <a:stretch>
+                      <a:fillRect/>
+                    </a:stretch>
+                  </pic:blipFill>
+                  <pic:spPr bwMode="auto">
+                    <a:xfrm>
+                      <a:off x="0" y="0"/>
+                      <a:ext cx="5905500" cy="3505200"/>
+                    </a:xfrm>
+                    <a:prstGeom prst="rect">
+                      <a:avLst/>
+                    </a:prstGeom>
+                  </pic:spPr>
+                </pic:pic>
+              </a:graphicData>
+            </a:graphic>
+          </wp:inline>
+        </w:drawing>
+      </w:r>
+    </w:p>
+    <w:p>
+      <w:pPr>
+        <w:spacing w:after="200"/>
+        <w:jc w:val="center"/>
+      </w:pPr>
+      <w:r>
+        <w:rPr>
+          <w:i/>
+          <w:iCs/>
+          <w:color w:val="55606B"/>
+          <w:sz w:val="18"/>
+          <w:szCs w:val="18"/>
+        </w:rPr>
+        <w:t>Figure 10. Le câblage, tel que la feuille 2 le présente.</w:t>
+      </w:r>
+    </w:p>
+    <w:p>
+      <w:pPr>
+        <w:pStyle w:val="Heading2"/>
+      </w:pPr>
+      <w:bookmarkStart w:id="9" w:name="_Toc244015092"/>
+      <w:r>
+        <w:t>4.5 Corriger un segment</w:t>
+      </w:r>
+      <w:bookmarkEnd w:id="9"/>
+    </w:p>
+    <w:p>
+      <w:pPr>
+        <w:spacing w:after="120" w:line="276" w:lineRule="auto"/>
+      </w:pPr>
+      <w:r>
+        <w:t>Le plan ne donne pas toujours le diamètre d'un segment, ni le repère de nomenclature qui s'y rattache. Dans ce cas le rapport contient une alerte diameter-missing ou une info segment-no-bom. Ce sont les seules données que vous pouvez compléter dans ARIANE : les connexions, elles, ne se modifient pas.</w:t>
+      </w:r>
+    </w:p>
+    <w:p>
+      <w:pPr>
+        <w:pStyle w:val="ListParagraph"/>
+        <w:numPr>
+          <w:ilvl w:val="0"/>
+          <w:numId w:val="2"/>
+        </w:numPr>
+        <w:spacing w:after="60"/>
+      </w:pPr>
+      <w:r>
+        <w:t>Ouvrez l'alerte depuis le rapport, ou cliquez le segment dans la vue Faisceau, ou cliquez une ligne du chemin d'un fil dans le panneau de droite.</w:t>
+      </w:r>
+    </w:p>
+    <w:p>
+      <w:pPr>
+        <w:pStyle w:val="ListParagraph"/>
+        <w:numPr>
+          <w:ilvl w:val="0"/>
+          <w:numId w:val="2"/>
+        </w:numPr>
+        <w:spacing w:after="60"/>
+      </w:pPr>
+      <w:r>
+        <w:t xml:space="preserve">Dans l'encadré </w:t>
+      </w:r>
+      <w:r>
+        <w:rPr>
+          <w:b/>
+          <w:bCs/>
+        </w:rPr>
+        <w:t>Corriger ce segment</w:t>
+      </w:r>
+      <w:r>
+        <w:t>, saisissez le diamètre en millimètres et, si besoin, les repères de nomenclature séparés par des espaces (07 09).</w:t>
+      </w:r>
+    </w:p>
+    <w:p>
+      <w:pPr>
+        <w:pStyle w:val="ListParagraph"/>
+        <w:numPr>
+          <w:ilvl w:val="0"/>
+          <w:numId w:val="2"/>
+        </w:numPr>
+        <w:spacing w:after="60"/>
+      </w:pPr>
+      <w:r>
+        <w:t xml:space="preserve">Cliquez sur </w:t>
+      </w:r>
+      <w:r>
+        <w:rPr>
+          <w:b/>
+          <w:bCs/>
+        </w:rPr>
+        <w:t>Enregistrer</w:t>
+      </w:r>
+      <w:r>
+        <w:t>.</w:t>
+      </w:r>
+    </w:p>
+    <w:p>
+      <w:pPr>
+        <w:keepNext/>
+        <w:spacing w:before="120" w:after="60"/>
+        <w:jc w:val="center"/>
+      </w:pPr>
+      <w:r>
+        <w:rPr>
+          <w:noProof/>
+        </w:rPr>
+        <w:drawing>
+          <wp:inline distT="0" distB="0" distL="0" distR="0" wp14:anchorId="3D48DFB2" wp14:editId="2FBA7E91">
+            <wp:extent cx="5905500" cy="3505200"/>
+            <wp:effectExtent l="0" t="0" r="0" b="0"/>
+            <wp:docPr id="933841538" name="13-editeur.png" descr="Un segment sans diamètre, ouvert depuis le rapport : l'encadré Corriger ce segment." title="Un segment sans diamètre, ouvert depuis le rapport : l'encadré Corriger ce segment."/>
+            <wp:cNvGraphicFramePr>
+              <a:graphicFrameLocks xmlns:a="http://schemas.openxmlformats.org/drawingml/2006/main" noChangeAspect="1"/>
+            </wp:cNvGraphicFramePr>
+            <a:graphic xmlns:a="http://schemas.openxmlformats.org/drawingml/2006/main">
+              <a:graphicData uri="http://schemas.openxmlformats.org/drawingml/2006/picture">
+                <pic:pic xmlns:pic="http://schemas.openxmlformats.org/drawingml/2006/picture">
+                  <pic:nvPicPr>
+                    <pic:cNvPr id="0" name=""/>
+                    <pic:cNvPicPr>
+                      <a:picLocks noChangeAspect="1" noChangeArrowheads="1"/>
+                    </pic:cNvPicPr>
+                  </pic:nvPicPr>
+                  <pic:blipFill>
+                    <a:blip r:embed="rId17"/>
+                    <a:srcRect/>
+                    <a:stretch>
+                      <a:fillRect/>
+                    </a:stretch>
+                  </pic:blipFill>
+                  <pic:spPr bwMode="auto">
+                    <a:xfrm>
+                      <a:off x="0" y="0"/>
+                      <a:ext cx="5905500" cy="3505200"/>
+                    </a:xfrm>
+                    <a:prstGeom prst="rect">
+                      <a:avLst/>
+                    </a:prstGeom>
+                  </pic:spPr>
+                </pic:pic>
+              </a:graphicData>
+            </a:graphic>
+          </wp:inline>
+        </w:drawing>
+      </w:r>
+    </w:p>
+    <w:p>
+      <w:pPr>
+        <w:spacing w:after="200"/>
+        <w:jc w:val="center"/>
+      </w:pPr>
+      <w:r>
+        <w:rPr>
+          <w:i/>
+          <w:iCs/>
+          <w:color w:val="55606B"/>
+          <w:sz w:val="18"/>
+          <w:szCs w:val="18"/>
+        </w:rPr>
+        <w:t>Figure 11. Un segment sans diamètre, ouvert depuis le rapport : l'encadré Corriger ce segment.</w:t>
+      </w:r>
+    </w:p>
+    <w:p>
+      <w:pPr>
+        <w:spacing w:after="120" w:line="276" w:lineRule="auto"/>
+      </w:pPr>
+      <w:r>
+        <w:t xml:space="preserve">Une valeur saisie n'est jamais confondue avec une valeur lue sur le plan. ARIANE retire l'alerte corrigée et la remplace par une info </w:t>
+      </w:r>
+      <w:r>
+        <w:rPr>
+          <w:b/>
+          <w:bCs/>
+        </w:rPr>
+        <w:t>topology-edited</w:t>
+      </w:r>
+      <w:r>
+        <w:t xml:space="preserve"> (visible avec le bouton Info du rapport) qui indique qui a saisi quoi. Le panneau affiche « saisi par » sous le formulaire, l'analyse conserve l'historique des corrections, et l'onglet Segments de l'export Excel porte « saisi » dans sa colonne Source (« plan » sinon). Le diamètre maximal d'un chemin tient compte de la valeur saisie à l'export suivant.</w:t>
       </w:r>
     </w:p>
     <w:p>
@@ -1987,11 +2362,11 @@
         <w:pStyle w:val="Heading1"/>
         <w:pageBreakBefore/>
       </w:pPr>
-      <w:bookmarkStart w:id="9" w:name="_Toc243993279"/>
+      <w:bookmarkStart w:id="10" w:name="_Toc244015093"/>
       <w:r>
         <w:t>5. Les contrôles</w:t>
       </w:r>
-      <w:bookmarkEnd w:id="9"/>
+      <w:bookmarkEnd w:id="10"/>
     </w:p>
     <w:p>
       <w:pPr>
@@ -2016,7 +2391,7 @@
           <w:left w:w="10" w:type="dxa"/>
           <w:right w:w="10" w:type="dxa"/>
         </w:tblCellMar>
-        <w:tblLook w:val="0000" w:firstRow="0" w:lastRow="0" w:firstColumn="0" w:lastColumn="0" w:noHBand="0" w:noVBand="0"/>
+        <w:tblLook w:val="04A0" w:firstRow="1" w:lastRow="0" w:firstColumn="1" w:lastColumn="0" w:noHBand="0" w:noVBand="1"/>
       </w:tblPr>
       <w:tblGrid>
         <w:gridCol w:w="2300"/>
@@ -2955,7 +3330,7 @@
                 <w:sz w:val="19"/>
                 <w:szCs w:val="19"/>
               </w:rPr>
-              <w:t>Lire le diamètre sur le plan et le reporter à la main.</w:t>
+              <w:t>Lire le diamètre sur le plan et le saisir (section 4.5).</w:t>
             </w:r>
           </w:p>
         </w:tc>
@@ -3305,6 +3680,121 @@
           </w:p>
         </w:tc>
       </w:tr>
+      <w:tr>
+        <w:tblPrEx>
+          <w:tblCellMar>
+            <w:top w:w="0" w:type="dxa"/>
+            <w:bottom w:w="0" w:type="dxa"/>
+          </w:tblCellMar>
+        </w:tblPrEx>
+        <w:trPr>
+          <w:cantSplit/>
+        </w:trPr>
+        <w:tc>
+          <w:tcPr>
+            <w:tcW w:w="2300" w:type="dxa"/>
+            <w:tcBorders>
+              <w:top w:val="single" w:sz="4" w:space="0" w:color="C9D3DC"/>
+              <w:left w:val="single" w:sz="4" w:space="0" w:color="C9D3DC"/>
+              <w:bottom w:val="single" w:sz="4" w:space="0" w:color="C9D3DC"/>
+              <w:right w:val="single" w:sz="4" w:space="0" w:color="C9D3DC"/>
+            </w:tcBorders>
+            <w:tcMar>
+              <w:top w:w="60" w:type="dxa"/>
+              <w:left w:w="100" w:type="dxa"/>
+              <w:bottom w:w="60" w:type="dxa"/>
+              <w:right w:w="100" w:type="dxa"/>
+            </w:tcMar>
+          </w:tcPr>
+          <w:p>
+            <w:r>
+              <w:rPr>
+                <w:sz w:val="19"/>
+                <w:szCs w:val="19"/>
+              </w:rPr>
+              <w:t>topology-edited</w:t>
+            </w:r>
+          </w:p>
+        </w:tc>
+        <w:tc>
+          <w:tcPr>
+            <w:tcW w:w="1100" w:type="dxa"/>
+            <w:tcBorders>
+              <w:top w:val="single" w:sz="4" w:space="0" w:color="C9D3DC"/>
+              <w:left w:val="single" w:sz="4" w:space="0" w:color="C9D3DC"/>
+              <w:bottom w:val="single" w:sz="4" w:space="0" w:color="C9D3DC"/>
+              <w:right w:val="single" w:sz="4" w:space="0" w:color="C9D3DC"/>
+            </w:tcBorders>
+            <w:tcMar>
+              <w:top w:w="60" w:type="dxa"/>
+              <w:left w:w="100" w:type="dxa"/>
+              <w:bottom w:w="60" w:type="dxa"/>
+              <w:right w:w="100" w:type="dxa"/>
+            </w:tcMar>
+          </w:tcPr>
+          <w:p>
+            <w:r>
+              <w:rPr>
+                <w:sz w:val="19"/>
+                <w:szCs w:val="19"/>
+              </w:rPr>
+              <w:t>Info</w:t>
+            </w:r>
+          </w:p>
+        </w:tc>
+        <w:tc>
+          <w:tcPr>
+            <w:tcW w:w="3300" w:type="dxa"/>
+            <w:tcBorders>
+              <w:top w:val="single" w:sz="4" w:space="0" w:color="C9D3DC"/>
+              <w:left w:val="single" w:sz="4" w:space="0" w:color="C9D3DC"/>
+              <w:bottom w:val="single" w:sz="4" w:space="0" w:color="C9D3DC"/>
+              <w:right w:val="single" w:sz="4" w:space="0" w:color="C9D3DC"/>
+            </w:tcBorders>
+            <w:tcMar>
+              <w:top w:w="60" w:type="dxa"/>
+              <w:left w:w="100" w:type="dxa"/>
+              <w:bottom w:w="60" w:type="dxa"/>
+              <w:right w:w="100" w:type="dxa"/>
+            </w:tcMar>
+          </w:tcPr>
+          <w:p>
+            <w:r>
+              <w:rPr>
+                <w:sz w:val="19"/>
+                <w:szCs w:val="19"/>
+              </w:rPr>
+              <w:t>Un segment a été complété à la main : diamètre ou repères de nomenclature saisis dans ARIANE.</w:t>
+            </w:r>
+          </w:p>
+        </w:tc>
+        <w:tc>
+          <w:tcPr>
+            <w:tcW w:w="2938" w:type="dxa"/>
+            <w:tcBorders>
+              <w:top w:val="single" w:sz="4" w:space="0" w:color="C9D3DC"/>
+              <w:left w:val="single" w:sz="4" w:space="0" w:color="C9D3DC"/>
+              <w:bottom w:val="single" w:sz="4" w:space="0" w:color="C9D3DC"/>
+              <w:right w:val="single" w:sz="4" w:space="0" w:color="C9D3DC"/>
+            </w:tcBorders>
+            <w:tcMar>
+              <w:top w:w="60" w:type="dxa"/>
+              <w:left w:w="100" w:type="dxa"/>
+              <w:bottom w:w="60" w:type="dxa"/>
+              <w:right w:w="100" w:type="dxa"/>
+            </w:tcMar>
+          </w:tcPr>
+          <w:p>
+            <w:r>
+              <w:rPr>
+                <w:sz w:val="19"/>
+                <w:szCs w:val="19"/>
+              </w:rPr>
+              <w:t>Aucune. Le message indique qui a saisi la valeur.</w:t>
+            </w:r>
+          </w:p>
+        </w:tc>
+      </w:tr>
     </w:tbl>
     <w:p>
       <w:pPr>
@@ -3324,11 +3814,11 @@
         <w:pStyle w:val="Heading1"/>
         <w:pageBreakBefore/>
       </w:pPr>
-      <w:bookmarkStart w:id="10" w:name="_Toc243993280"/>
+      <w:bookmarkStart w:id="11" w:name="_Toc244015094"/>
       <w:r>
         <w:t>6. Exporter les résultats</w:t>
       </w:r>
-      <w:bookmarkEnd w:id="10"/>
+      <w:bookmarkEnd w:id="11"/>
     </w:p>
     <w:p>
       <w:pPr>
@@ -3342,11 +3832,11 @@
       <w:pPr>
         <w:pStyle w:val="Heading2"/>
       </w:pPr>
-      <w:bookmarkStart w:id="11" w:name="_Toc243993281"/>
+      <w:bookmarkStart w:id="12" w:name="_Toc244015095"/>
       <w:r>
         <w:t>6.1 Le formulaire de l'export Excel</w:t>
       </w:r>
-      <w:bookmarkEnd w:id="11"/>
+      <w:bookmarkEnd w:id="12"/>
     </w:p>
     <w:p>
       <w:pPr>
@@ -3377,300 +3867,10 @@
           <w:noProof/>
         </w:rPr>
         <w:drawing>
-          <wp:inline distT="0" distB="0" distL="0" distR="0" wp14:anchorId="2EEDEA1F" wp14:editId="783B6EBD">
+          <wp:inline distT="0" distB="0" distL="0" distR="0" wp14:anchorId="20963E6B" wp14:editId="3EE55C1F">
             <wp:extent cx="5905500" cy="3505200"/>
             <wp:effectExtent l="0" t="0" r="0" b="0"/>
-            <wp:docPr id="919232103" name="10-export.png" descr="Le formulaire de l'export Excel, rempli pour l'exemple." title="Le formulaire de l'export Excel, rempli pour l'exemple."/>
-            <wp:cNvGraphicFramePr>
-              <a:graphicFrameLocks xmlns:a="http://schemas.openxmlformats.org/drawingml/2006/main" noChangeAspect="1"/>
-            </wp:cNvGraphicFramePr>
-            <a:graphic xmlns:a="http://schemas.openxmlformats.org/drawingml/2006/main">
-              <a:graphicData uri="http://schemas.openxmlformats.org/drawingml/2006/picture">
-                <pic:pic xmlns:pic="http://schemas.openxmlformats.org/drawingml/2006/picture">
-                  <pic:nvPicPr>
-                    <pic:cNvPr id="0" name=""/>
-                    <pic:cNvPicPr>
-                      <a:picLocks noChangeAspect="1" noChangeArrowheads="1"/>
-                    </pic:cNvPicPr>
-                  </pic:nvPicPr>
-                  <pic:blipFill>
-                    <a:blip r:embed="rId15"/>
-                    <a:srcRect/>
-                    <a:stretch>
-                      <a:fillRect/>
-                    </a:stretch>
-                  </pic:blipFill>
-                  <pic:spPr bwMode="auto">
-                    <a:xfrm>
-                      <a:off x="0" y="0"/>
-                      <a:ext cx="5905500" cy="3505200"/>
-                    </a:xfrm>
-                    <a:prstGeom prst="rect">
-                      <a:avLst/>
-                    </a:prstGeom>
-                  </pic:spPr>
-                </pic:pic>
-              </a:graphicData>
-            </a:graphic>
-          </wp:inline>
-        </w:drawing>
-      </w:r>
-    </w:p>
-    <w:p>
-      <w:pPr>
-        <w:spacing w:after="200"/>
-        <w:jc w:val="center"/>
-      </w:pPr>
-      <w:r>
-        <w:rPr>
-          <w:i/>
-          <w:iCs/>
-          <w:color w:val="55606B"/>
-          <w:sz w:val="18"/>
-          <w:szCs w:val="18"/>
-        </w:rPr>
-        <w:t>Figure 9. Le formulaire de l'export Excel, rempli pour l'exemple.</w:t>
-      </w:r>
-    </w:p>
-    <w:p>
-      <w:pPr>
-        <w:pStyle w:val="Heading2"/>
-      </w:pPr>
-      <w:bookmarkStart w:id="12" w:name="_Toc243993282"/>
-      <w:r>
-        <w:t>6.2 Le classeur</w:t>
-      </w:r>
-      <w:bookmarkEnd w:id="12"/>
-    </w:p>
-    <w:p>
-      <w:pPr>
-        <w:spacing w:after="120" w:line="276" w:lineRule="auto"/>
-      </w:pPr>
-      <w:r>
-        <w:t>Le classeur contient six onglets. Les cinq derniers portent le même bandeau : logo, titre, référence, date et édition, suivi d'une ligne vide avant le tableau.</w:t>
-      </w:r>
-    </w:p>
-    <w:p>
-      <w:pPr>
-        <w:spacing w:after="120" w:line="276" w:lineRule="auto"/>
-      </w:pPr>
-      <w:r>
-        <w:t>La page de garde reprend le modèle de document de l'entreprise (figure 10). Les cases de classification sont cochées selon le formulaire, et les noms saisis apparaissent dans les cadres d'approbation.</w:t>
-      </w:r>
-    </w:p>
-    <w:p>
-      <w:pPr>
-        <w:keepNext/>
-        <w:spacing w:before="120" w:after="60"/>
-        <w:jc w:val="center"/>
-      </w:pPr>
-      <w:r>
-        <w:rPr>
-          <w:noProof/>
-        </w:rPr>
-        <w:drawing>
-          <wp:inline distT="0" distB="0" distL="0" distR="0" wp14:anchorId="1B1453CE" wp14:editId="75DFC526">
-            <wp:extent cx="4095750" cy="6286500"/>
-            <wp:effectExtent l="0" t="0" r="0" b="0"/>
-            <wp:docPr id="355531343" name="xl-page-de-garde.png" descr="L'onglet Page de garde, rendu par Excel." title="L'onglet Page de garde, rendu par Excel."/>
-            <wp:cNvGraphicFramePr>
-              <a:graphicFrameLocks xmlns:a="http://schemas.openxmlformats.org/drawingml/2006/main" noChangeAspect="1"/>
-            </wp:cNvGraphicFramePr>
-            <a:graphic xmlns:a="http://schemas.openxmlformats.org/drawingml/2006/main">
-              <a:graphicData uri="http://schemas.openxmlformats.org/drawingml/2006/picture">
-                <pic:pic xmlns:pic="http://schemas.openxmlformats.org/drawingml/2006/picture">
-                  <pic:nvPicPr>
-                    <pic:cNvPr id="0" name=""/>
-                    <pic:cNvPicPr>
-                      <a:picLocks noChangeAspect="1" noChangeArrowheads="1"/>
-                    </pic:cNvPicPr>
-                  </pic:nvPicPr>
-                  <pic:blipFill>
-                    <a:blip r:embed="rId16"/>
-                    <a:srcRect/>
-                    <a:stretch>
-                      <a:fillRect/>
-                    </a:stretch>
-                  </pic:blipFill>
-                  <pic:spPr bwMode="auto">
-                    <a:xfrm>
-                      <a:off x="0" y="0"/>
-                      <a:ext cx="4095750" cy="6286500"/>
-                    </a:xfrm>
-                    <a:prstGeom prst="rect">
-                      <a:avLst/>
-                    </a:prstGeom>
-                  </pic:spPr>
-                </pic:pic>
-              </a:graphicData>
-            </a:graphic>
-          </wp:inline>
-        </w:drawing>
-      </w:r>
-    </w:p>
-    <w:p>
-      <w:pPr>
-        <w:spacing w:after="200"/>
-        <w:jc w:val="center"/>
-      </w:pPr>
-      <w:r>
-        <w:rPr>
-          <w:i/>
-          <w:iCs/>
-          <w:color w:val="55606B"/>
-          <w:sz w:val="18"/>
-          <w:szCs w:val="18"/>
-        </w:rPr>
-        <w:t>Figure 10. L'onglet Page de garde, rendu par Excel.</w:t>
-      </w:r>
-    </w:p>
-    <w:p>
-      <w:pPr>
-        <w:spacing w:after="120" w:line="276" w:lineRule="auto"/>
-      </w:pPr>
-      <w:r>
-        <w:t xml:space="preserve">L'onglet </w:t>
-      </w:r>
-      <w:r>
-        <w:rPr>
-          <w:b/>
-          <w:bCs/>
-        </w:rPr>
-        <w:t>From-To</w:t>
-      </w:r>
-      <w:r>
-        <w:t xml:space="preserve"> donne une ligne par fil : numéro, paire, polarité, signal, type de câble, connecteur et pin de départ, connecteur et pin d'arrivée, segments traversés et diamètre maximal. Les lignes en erreur sont colorées en rose, ainsi que les fils non routés, qui portent la mention NON ROUTÉ.</w:t>
-      </w:r>
-    </w:p>
-    <w:p>
-      <w:pPr>
-        <w:keepNext/>
-        <w:spacing w:before="120" w:after="60"/>
-        <w:jc w:val="center"/>
-      </w:pPr>
-      <w:r>
-        <w:rPr>
-          <w:noProof/>
-        </w:rPr>
-        <w:drawing>
-          <wp:inline distT="0" distB="0" distL="0" distR="0" wp14:anchorId="249B2F4E" wp14:editId="70727769">
-            <wp:extent cx="5905500" cy="2381250"/>
-            <wp:effectExtent l="0" t="0" r="0" b="0"/>
-            <wp:docPr id="1389548881" name="xl-from-to.png" descr="Onglet From-To (les premières lignes)." title="Onglet From-To (les premières lignes)."/>
-            <wp:cNvGraphicFramePr>
-              <a:graphicFrameLocks xmlns:a="http://schemas.openxmlformats.org/drawingml/2006/main" noChangeAspect="1"/>
-            </wp:cNvGraphicFramePr>
-            <a:graphic xmlns:a="http://schemas.openxmlformats.org/drawingml/2006/main">
-              <a:graphicData uri="http://schemas.openxmlformats.org/drawingml/2006/picture">
-                <pic:pic xmlns:pic="http://schemas.openxmlformats.org/drawingml/2006/picture">
-                  <pic:nvPicPr>
-                    <pic:cNvPr id="0" name=""/>
-                    <pic:cNvPicPr>
-                      <a:picLocks noChangeAspect="1" noChangeArrowheads="1"/>
-                    </pic:cNvPicPr>
-                  </pic:nvPicPr>
-                  <pic:blipFill>
-                    <a:blip r:embed="rId17"/>
-                    <a:srcRect/>
-                    <a:stretch>
-                      <a:fillRect/>
-                    </a:stretch>
-                  </pic:blipFill>
-                  <pic:spPr bwMode="auto">
-                    <a:xfrm>
-                      <a:off x="0" y="0"/>
-                      <a:ext cx="5905500" cy="2381250"/>
-                    </a:xfrm>
-                    <a:prstGeom prst="rect">
-                      <a:avLst/>
-                    </a:prstGeom>
-                  </pic:spPr>
-                </pic:pic>
-              </a:graphicData>
-            </a:graphic>
-          </wp:inline>
-        </w:drawing>
-      </w:r>
-    </w:p>
-    <w:p>
-      <w:pPr>
-        <w:spacing w:after="200"/>
-        <w:jc w:val="center"/>
-      </w:pPr>
-      <w:r>
-        <w:rPr>
-          <w:i/>
-          <w:iCs/>
-          <w:color w:val="55606B"/>
-          <w:sz w:val="18"/>
-          <w:szCs w:val="18"/>
-        </w:rPr>
-        <w:t>Figure 11. Onglet From-To (les premières lignes).</w:t>
-      </w:r>
-    </w:p>
-    <w:p>
-      <w:pPr>
-        <w:spacing w:after="120" w:line="276" w:lineRule="auto"/>
-      </w:pPr>
-      <w:r>
-        <w:t xml:space="preserve">L'onglet </w:t>
-      </w:r>
-      <w:r>
-        <w:rPr>
-          <w:b/>
-          <w:bCs/>
-        </w:rPr>
-        <w:t>Connecteurs</w:t>
-      </w:r>
-      <w:r>
-        <w:t xml:space="preserve"> liste chaque pin avec le ou les fils qu'elle porte et l'origine ou la destination écrite sur le plan. L'onglet </w:t>
-      </w:r>
-      <w:r>
-        <w:rPr>
-          <w:b/>
-          <w:bCs/>
-        </w:rPr>
-        <w:t>Segments</w:t>
-      </w:r>
-      <w:r>
-        <w:t xml:space="preserve"> décrit chaque segment de la topologie : nœuds, diamètre, repères de nomenclature et longueur sur le plan. L'onglet </w:t>
-      </w:r>
-      <w:r>
-        <w:rPr>
-          <w:b/>
-          <w:bCs/>
-        </w:rPr>
-        <w:t>Nomenclature</w:t>
-      </w:r>
-      <w:r>
-        <w:t xml:space="preserve"> reprend les 48 positions du fichier PL, avec une colonne TBD pour les quantités à définir. L'onglet </w:t>
-      </w:r>
-      <w:r>
-        <w:rPr>
-          <w:b/>
-          <w:bCs/>
-        </w:rPr>
-        <w:t>Rapport</w:t>
-      </w:r>
-      <w:r>
-        <w:t xml:space="preserve"> reprend les contrôles, les erreurs d'abord.</w:t>
-      </w:r>
-    </w:p>
-    <w:p>
-      <w:pPr>
-        <w:keepNext/>
-        <w:spacing w:before="120" w:after="60"/>
-        <w:jc w:val="center"/>
-      </w:pPr>
-      <w:r>
-        <w:rPr>
-          <w:noProof/>
-        </w:rPr>
-        <w:drawing>
-          <wp:inline distT="0" distB="0" distL="0" distR="0" wp14:anchorId="725BDA32" wp14:editId="48CEB576">
-            <wp:extent cx="5905500" cy="3381375"/>
-            <wp:effectExtent l="0" t="0" r="0" b="0"/>
-            <wp:docPr id="1194375863" name="xl-connecteurs.png" descr="Onglet Connecteurs." title="Onglet Connecteurs."/>
+            <wp:docPr id="1315694369" name="10-export.png" descr="Le formulaire de l'export Excel, rempli pour l'exemple." title="Le formulaire de l'export Excel, rempli pour l'exemple."/>
             <wp:cNvGraphicFramePr>
               <a:graphicFrameLocks xmlns:a="http://schemas.openxmlformats.org/drawingml/2006/main" noChangeAspect="1"/>
             </wp:cNvGraphicFramePr>
@@ -3693,7 +3893,7 @@
                   <pic:spPr bwMode="auto">
                     <a:xfrm>
                       <a:off x="0" y="0"/>
-                      <a:ext cx="5905500" cy="3381375"/>
+                      <a:ext cx="5905500" cy="3505200"/>
                     </a:xfrm>
                     <a:prstGeom prst="rect">
                       <a:avLst/>
@@ -3719,7 +3919,33 @@
           <w:sz w:val="18"/>
           <w:szCs w:val="18"/>
         </w:rPr>
-        <w:t>Figure 12. Onglet Connecteurs.</w:t>
+        <w:t>Figure 12. Le formulaire de l'export Excel, rempli pour l'exemple.</w:t>
+      </w:r>
+    </w:p>
+    <w:p>
+      <w:pPr>
+        <w:pStyle w:val="Heading2"/>
+      </w:pPr>
+      <w:bookmarkStart w:id="13" w:name="_Toc244015096"/>
+      <w:r>
+        <w:t>6.2 Le classeur</w:t>
+      </w:r>
+      <w:bookmarkEnd w:id="13"/>
+    </w:p>
+    <w:p>
+      <w:pPr>
+        <w:spacing w:after="120" w:line="276" w:lineRule="auto"/>
+      </w:pPr>
+      <w:r>
+        <w:t>Le classeur contient six onglets. Les cinq derniers portent le même bandeau : logo, titre, référence, date et édition, suivi d'une ligne vide avant le tableau.</w:t>
+      </w:r>
+    </w:p>
+    <w:p>
+      <w:pPr>
+        <w:spacing w:after="120" w:line="276" w:lineRule="auto"/>
+      </w:pPr>
+      <w:r>
+        <w:t>La page de garde reprend le modèle de document Hemeria (figure 13). Les cases de classification sont cochées selon le formulaire, et les noms saisis apparaissent dans les cadres d'approbation. Une rubrique laissée vide dans le formulaire reste vide sur la page : le modèle ne la remplit pas avec un texte d'exemple.</w:t>
       </w:r>
     </w:p>
     <w:p>
@@ -3733,10 +3959,10 @@
           <w:noProof/>
         </w:rPr>
         <w:drawing>
-          <wp:inline distT="0" distB="0" distL="0" distR="0" wp14:anchorId="3D144F1A" wp14:editId="4F2B6D1D">
-            <wp:extent cx="5905500" cy="3333750"/>
+          <wp:inline distT="0" distB="0" distL="0" distR="0" wp14:anchorId="000BF585" wp14:editId="65D6A424">
+            <wp:extent cx="4095750" cy="6305550"/>
             <wp:effectExtent l="0" t="0" r="0" b="0"/>
-            <wp:docPr id="1391978728" name="xl-rapport.png" descr="Onglet Rapport : les erreurs sont en rose, les alertes en jaune." title="Onglet Rapport : les erreurs sont en rose, les alertes en jaune."/>
+            <wp:docPr id="1563338753" name="xl-page-de-garde.png" descr="L'onglet Page de garde, rendu par Excel." title="L'onglet Page de garde, rendu par Excel."/>
             <wp:cNvGraphicFramePr>
               <a:graphicFrameLocks xmlns:a="http://schemas.openxmlformats.org/drawingml/2006/main" noChangeAspect="1"/>
             </wp:cNvGraphicFramePr>
@@ -3759,7 +3985,7 @@
                   <pic:spPr bwMode="auto">
                     <a:xfrm>
                       <a:off x="0" y="0"/>
-                      <a:ext cx="5905500" cy="3333750"/>
+                      <a:ext cx="4095750" cy="6305550"/>
                     </a:xfrm>
                     <a:prstGeom prst="rect">
                       <a:avLst/>
@@ -3785,7 +4011,7 @@
           <w:sz w:val="18"/>
           <w:szCs w:val="18"/>
         </w:rPr>
-        <w:t>Figure 13. Onglet Rapport : les erreurs sont en rose, les alertes en jaune.</w:t>
+        <w:t>Figure 13. L'onglet Page de garde, rendu par Excel.</w:t>
       </w:r>
     </w:p>
     <w:p>
@@ -3793,7 +4019,271 @@
         <w:spacing w:after="120" w:line="276" w:lineRule="auto"/>
       </w:pPr>
       <w:r>
-        <w:t>Le fichier d'exemple complet, produit avec les réglages de la figure 9, est fourni avec ce manuel sous le nom exemple-export.xlsx.</w:t>
+        <w:t xml:space="preserve">L'onglet </w:t>
+      </w:r>
+      <w:r>
+        <w:rPr>
+          <w:b/>
+          <w:bCs/>
+        </w:rPr>
+        <w:t>From-To</w:t>
+      </w:r>
+      <w:r>
+        <w:t xml:space="preserve"> donne une ligne par fil : numéro, paire, polarité, signal, type de câble, connecteur et pin de départ, connecteur et pin d'arrivée, segments traversés et diamètre maximal. Les lignes en erreur sont colorées en rose, ainsi que les fils non routés, qui portent la mention NON ROUTÉ.</w:t>
+      </w:r>
+    </w:p>
+    <w:p>
+      <w:pPr>
+        <w:keepNext/>
+        <w:spacing w:before="120" w:after="60"/>
+        <w:jc w:val="center"/>
+      </w:pPr>
+      <w:r>
+        <w:rPr>
+          <w:noProof/>
+        </w:rPr>
+        <w:drawing>
+          <wp:inline distT="0" distB="0" distL="0" distR="0" wp14:anchorId="7663D517" wp14:editId="6EF2BCED">
+            <wp:extent cx="5905500" cy="1762125"/>
+            <wp:effectExtent l="0" t="0" r="0" b="0"/>
+            <wp:docPr id="1849344977" name="xl-from-to.png" descr="Onglet From-To (les premières lignes)." title="Onglet From-To (les premières lignes)."/>
+            <wp:cNvGraphicFramePr>
+              <a:graphicFrameLocks xmlns:a="http://schemas.openxmlformats.org/drawingml/2006/main" noChangeAspect="1"/>
+            </wp:cNvGraphicFramePr>
+            <a:graphic xmlns:a="http://schemas.openxmlformats.org/drawingml/2006/main">
+              <a:graphicData uri="http://schemas.openxmlformats.org/drawingml/2006/picture">
+                <pic:pic xmlns:pic="http://schemas.openxmlformats.org/drawingml/2006/picture">
+                  <pic:nvPicPr>
+                    <pic:cNvPr id="0" name=""/>
+                    <pic:cNvPicPr>
+                      <a:picLocks noChangeAspect="1" noChangeArrowheads="1"/>
+                    </pic:cNvPicPr>
+                  </pic:nvPicPr>
+                  <pic:blipFill>
+                    <a:blip r:embed="rId20"/>
+                    <a:srcRect/>
+                    <a:stretch>
+                      <a:fillRect/>
+                    </a:stretch>
+                  </pic:blipFill>
+                  <pic:spPr bwMode="auto">
+                    <a:xfrm>
+                      <a:off x="0" y="0"/>
+                      <a:ext cx="5905500" cy="1762125"/>
+                    </a:xfrm>
+                    <a:prstGeom prst="rect">
+                      <a:avLst/>
+                    </a:prstGeom>
+                  </pic:spPr>
+                </pic:pic>
+              </a:graphicData>
+            </a:graphic>
+          </wp:inline>
+        </w:drawing>
+      </w:r>
+    </w:p>
+    <w:p>
+      <w:pPr>
+        <w:spacing w:after="200"/>
+        <w:jc w:val="center"/>
+      </w:pPr>
+      <w:r>
+        <w:rPr>
+          <w:i/>
+          <w:iCs/>
+          <w:color w:val="55606B"/>
+          <w:sz w:val="18"/>
+          <w:szCs w:val="18"/>
+        </w:rPr>
+        <w:t>Figure 14. Onglet From-To (les premières lignes).</w:t>
+      </w:r>
+    </w:p>
+    <w:p>
+      <w:pPr>
+        <w:spacing w:after="120" w:line="276" w:lineRule="auto"/>
+      </w:pPr>
+      <w:r>
+        <w:t xml:space="preserve">L'onglet </w:t>
+      </w:r>
+      <w:r>
+        <w:rPr>
+          <w:b/>
+          <w:bCs/>
+        </w:rPr>
+        <w:t>Connecteurs</w:t>
+      </w:r>
+      <w:r>
+        <w:t xml:space="preserve"> liste chaque pin avec le ou les fils qu'elle porte et l'origine ou la destination écrite sur le plan. Les places vides dont les lettres sont connues y figurent aussi, sur fond gris, avec la mention « place vide ». L'onglet </w:t>
+      </w:r>
+      <w:r>
+        <w:rPr>
+          <w:b/>
+          <w:bCs/>
+        </w:rPr>
+        <w:t>Segments</w:t>
+      </w:r>
+      <w:r>
+        <w:t xml:space="preserve"> décrit chaque segment de la topologie : nœuds, diamètre, repères de nomenclature, longueur sur le plan et source de la valeur (plan ou saisi). L'onglet </w:t>
+      </w:r>
+      <w:r>
+        <w:rPr>
+          <w:b/>
+          <w:bCs/>
+        </w:rPr>
+        <w:t>Nomenclature</w:t>
+      </w:r>
+      <w:r>
+        <w:t xml:space="preserve"> reprend les 48 positions du fichier PL, avec une colonne TBD pour les quantités à définir. L'onglet </w:t>
+      </w:r>
+      <w:r>
+        <w:rPr>
+          <w:b/>
+          <w:bCs/>
+        </w:rPr>
+        <w:t>Rapport</w:t>
+      </w:r>
+      <w:r>
+        <w:t xml:space="preserve"> reprend les contrôles, les erreurs d'abord.</w:t>
+      </w:r>
+    </w:p>
+    <w:p>
+      <w:pPr>
+        <w:keepNext/>
+        <w:spacing w:before="120" w:after="60"/>
+        <w:jc w:val="center"/>
+      </w:pPr>
+      <w:r>
+        <w:rPr>
+          <w:noProof/>
+        </w:rPr>
+        <w:drawing>
+          <wp:inline distT="0" distB="0" distL="0" distR="0" wp14:anchorId="7146CDC0" wp14:editId="4450301E">
+            <wp:extent cx="5905500" cy="2514600"/>
+            <wp:effectExtent l="0" t="0" r="0" b="0"/>
+            <wp:docPr id="174389612" name="xl-connecteurs.png" descr="Onglet Connecteurs." title="Onglet Connecteurs."/>
+            <wp:cNvGraphicFramePr>
+              <a:graphicFrameLocks xmlns:a="http://schemas.openxmlformats.org/drawingml/2006/main" noChangeAspect="1"/>
+            </wp:cNvGraphicFramePr>
+            <a:graphic xmlns:a="http://schemas.openxmlformats.org/drawingml/2006/main">
+              <a:graphicData uri="http://schemas.openxmlformats.org/drawingml/2006/picture">
+                <pic:pic xmlns:pic="http://schemas.openxmlformats.org/drawingml/2006/picture">
+                  <pic:nvPicPr>
+                    <pic:cNvPr id="0" name=""/>
+                    <pic:cNvPicPr>
+                      <a:picLocks noChangeAspect="1" noChangeArrowheads="1"/>
+                    </pic:cNvPicPr>
+                  </pic:nvPicPr>
+                  <pic:blipFill>
+                    <a:blip r:embed="rId21"/>
+                    <a:srcRect/>
+                    <a:stretch>
+                      <a:fillRect/>
+                    </a:stretch>
+                  </pic:blipFill>
+                  <pic:spPr bwMode="auto">
+                    <a:xfrm>
+                      <a:off x="0" y="0"/>
+                      <a:ext cx="5905500" cy="2514600"/>
+                    </a:xfrm>
+                    <a:prstGeom prst="rect">
+                      <a:avLst/>
+                    </a:prstGeom>
+                  </pic:spPr>
+                </pic:pic>
+              </a:graphicData>
+            </a:graphic>
+          </wp:inline>
+        </w:drawing>
+      </w:r>
+    </w:p>
+    <w:p>
+      <w:pPr>
+        <w:spacing w:after="200"/>
+        <w:jc w:val="center"/>
+      </w:pPr>
+      <w:r>
+        <w:rPr>
+          <w:i/>
+          <w:iCs/>
+          <w:color w:val="55606B"/>
+          <w:sz w:val="18"/>
+          <w:szCs w:val="18"/>
+        </w:rPr>
+        <w:t>Figure 15. Onglet Connecteurs.</w:t>
+      </w:r>
+    </w:p>
+    <w:p>
+      <w:pPr>
+        <w:keepNext/>
+        <w:spacing w:before="120" w:after="60"/>
+        <w:jc w:val="center"/>
+      </w:pPr>
+      <w:r>
+        <w:rPr>
+          <w:noProof/>
+        </w:rPr>
+        <w:drawing>
+          <wp:inline distT="0" distB="0" distL="0" distR="0" wp14:anchorId="5352C1FE" wp14:editId="28E917F9">
+            <wp:extent cx="5905500" cy="2505075"/>
+            <wp:effectExtent l="0" t="0" r="0" b="0"/>
+            <wp:docPr id="532353831" name="xl-rapport.png" descr="Onglet Rapport : les erreurs sont en rose, les alertes en jaune." title="Onglet Rapport : les erreurs sont en rose, les alertes en jaune."/>
+            <wp:cNvGraphicFramePr>
+              <a:graphicFrameLocks xmlns:a="http://schemas.openxmlformats.org/drawingml/2006/main" noChangeAspect="1"/>
+            </wp:cNvGraphicFramePr>
+            <a:graphic xmlns:a="http://schemas.openxmlformats.org/drawingml/2006/main">
+              <a:graphicData uri="http://schemas.openxmlformats.org/drawingml/2006/picture">
+                <pic:pic xmlns:pic="http://schemas.openxmlformats.org/drawingml/2006/picture">
+                  <pic:nvPicPr>
+                    <pic:cNvPr id="0" name=""/>
+                    <pic:cNvPicPr>
+                      <a:picLocks noChangeAspect="1" noChangeArrowheads="1"/>
+                    </pic:cNvPicPr>
+                  </pic:nvPicPr>
+                  <pic:blipFill>
+                    <a:blip r:embed="rId22"/>
+                    <a:srcRect/>
+                    <a:stretch>
+                      <a:fillRect/>
+                    </a:stretch>
+                  </pic:blipFill>
+                  <pic:spPr bwMode="auto">
+                    <a:xfrm>
+                      <a:off x="0" y="0"/>
+                      <a:ext cx="5905500" cy="2505075"/>
+                    </a:xfrm>
+                    <a:prstGeom prst="rect">
+                      <a:avLst/>
+                    </a:prstGeom>
+                  </pic:spPr>
+                </pic:pic>
+              </a:graphicData>
+            </a:graphic>
+          </wp:inline>
+        </w:drawing>
+      </w:r>
+    </w:p>
+    <w:p>
+      <w:pPr>
+        <w:spacing w:after="200"/>
+        <w:jc w:val="center"/>
+      </w:pPr>
+      <w:r>
+        <w:rPr>
+          <w:i/>
+          <w:iCs/>
+          <w:color w:val="55606B"/>
+          <w:sz w:val="18"/>
+          <w:szCs w:val="18"/>
+        </w:rPr>
+        <w:t>Figure 16. Onglet Rapport : les erreurs sont en rose, les alertes en jaune.</w:t>
+      </w:r>
+    </w:p>
+    <w:p>
+      <w:pPr>
+        <w:spacing w:after="120" w:line="276" w:lineRule="auto"/>
+      </w:pPr>
+      <w:r>
+        <w:t>Le fichier d'exemple complet, produit avec les réglages de la figure 12, est fourni avec ce manuel sous le nom exemple-export.xlsx.</w:t>
       </w:r>
     </w:p>
     <w:p>
@@ -3801,11 +4291,11 @@
         <w:pStyle w:val="Heading1"/>
         <w:pageBreakBefore/>
       </w:pPr>
-      <w:bookmarkStart w:id="13" w:name="_Toc243993283"/>
+      <w:bookmarkStart w:id="14" w:name="_Toc244015097"/>
       <w:r>
         <w:t>7. Points à connaître</w:t>
       </w:r>
-      <w:bookmarkEnd w:id="13"/>
+      <w:bookmarkEnd w:id="14"/>
     </w:p>
     <w:p>
       <w:pPr>
@@ -3830,7 +4320,7 @@
         <w:spacing w:after="60"/>
       </w:pPr>
       <w:r>
-        <w:t>ARIANE indique le nombre de places vides par connecteur, mais pas encore leurs lettres. Ce sont par exemple les pins C, F et M sur certains blocs S/C.</w:t>
+        <w:t>Les lettres des places vides ne s'affichent que pour les inserts dont la disposition est connue du plugin. C'est le cas du 20FD19 des blocs S/C. Pour le 26FJ61 des connecteurs INIT, ARIANE ne donne que le nombre de places vides.</w:t>
       </w:r>
     </w:p>
     <w:p>
@@ -3843,7 +4333,7 @@
         <w:spacing w:after="60"/>
       </w:pPr>
       <w:r>
-        <w:t>Un diamètre introuvable ne peut pas encore se corriger dans l'application. Le segment N3A-N1A de l'exemple est dans ce cas et le diamètre maximal d'un chemin qui le traverse ne le prend pas en compte.</w:t>
+        <w:t>Un diamètre ou un repère de nomenclature manquant se complète dans l'application (section 4.5), mais les connexions et les routes ne se modifient pas. Tant que le diamètre du segment N3A-N1A de l'exemple n'est pas saisi, le diamètre maximal des chemins qui le traversent ne le prend pas en compte.</w:t>
       </w:r>
     </w:p>
     <w:p>
@@ -3881,8 +4371,8 @@
       </w:r>
     </w:p>
     <w:sectPr>
-      <w:headerReference w:type="default" r:id="rId20"/>
-      <w:footerReference w:type="default" r:id="rId21"/>
+      <w:headerReference w:type="default" r:id="rId23"/>
+      <w:footerReference w:type="default" r:id="rId24"/>
       <w:pgSz w:w="11906" w:h="16838"/>
       <w:pgMar w:top="1300" w:right="1134" w:bottom="1134" w:left="1134" w:header="708" w:footer="708" w:gutter="0"/>
       <w:cols w:space="720"/>
@@ -4061,10 +4551,96 @@
 <file path=word/numbering.xml><?xml version="1.0" encoding="utf-8"?>
 <w:numbering xmlns:wpc="http://schemas.microsoft.com/office/word/2010/wordprocessingCanvas" xmlns:cx="http://schemas.microsoft.com/office/drawing/2014/chartex" xmlns:cx1="http://schemas.microsoft.com/office/drawing/2015/9/8/chartex" xmlns:cx2="http://schemas.microsoft.com/office/drawing/2015/10/21/chartex" xmlns:cx3="http://schemas.microsoft.com/office/drawing/2016/5/9/chartex" xmlns:cx4="http://schemas.microsoft.com/office/drawing/2016/5/10/chartex" xmlns:cx5="http://schemas.microsoft.com/office/drawing/2016/5/11/chartex" xmlns:cx6="http://schemas.microsoft.com/office/drawing/2016/5/12/chartex" xmlns:cx7="http://schemas.microsoft.com/office/drawing/2016/5/13/chartex" xmlns:cx8="http://schemas.microsoft.com/office/drawing/2016/5/14/chartex" xmlns:mc="http://schemas.openxmlformats.org/markup-compatibility/2006" xmlns:aink="http://schemas.microsoft.com/office/drawing/2016/ink" xmlns:am3d="http://schemas.microsoft.com/office/drawing/2017/model3d" xmlns:o="urn:schemas-microsoft-com:office:office" xmlns:oel="http://schemas.microsoft.com/office/2019/extlst" xmlns:r="http://schemas.openxmlformats.org/officeDocument/2006/relationships" xmlns:m="http://schemas.openxmlformats.org/officeDocument/2006/math" xmlns:v="urn:schemas-microsoft-com:vml" xmlns:wp14="http://schemas.microsoft.com/office/word/2010/wordprocessingDrawing" xmlns:wp="http://schemas.openxmlformats.org/drawingml/2006/wordprocessingDrawing" xmlns:w10="urn:schemas-microsoft-com:office:word" xmlns:w="http://schemas.openxmlformats.org/wordprocessingml/2006/main" xmlns:w14="http://schemas.microsoft.com/office/word/2010/wordml" xmlns:w15="http://schemas.microsoft.com/office/word/2012/wordml" xmlns:w16cex="http://schemas.microsoft.com/office/word/2018/wordml/cex" xmlns:w16cid="http://schemas.microsoft.com/office/word/2016/wordml/cid" xmlns:w16="http://schemas.microsoft.com/office/word/2018/wordml" xmlns:w16du="http://schemas.microsoft.com/office/word/2023/wordml/word16du" xmlns:w16sdtdh="http://schemas.microsoft.com/office/word/2020/wordml/sdtdatahash" xmlns:w16sdtfl="http://schemas.microsoft.com/office/word/2024/wordml/sdtformatlock" xmlns:w16se="http://schemas.microsoft.com/office/word/2015/wordml/symex" xmlns:wpg="http://schemas.microsoft.com/office/word/2010/wordprocessingGroup" xmlns:wpi="http://schemas.microsoft.com/office/word/2010/wordprocessingInk" xmlns:wne="http://schemas.microsoft.com/office/word/2006/wordml" xmlns:wps="http://schemas.microsoft.com/office/word/2010/wordprocessingShape" mc:Ignorable="w14 w15 w16se w16cid w16 w16cex w16sdtdh w16sdtfl w16du wp14">
   <w:abstractNum w:abstractNumId="0" w15:restartNumberingAfterBreak="0">
-    <w:nsid w:val="491C6E82"/>
+    <w:nsid w:val="21421E17"/>
     <w:multiLevelType w:val="hybridMultilevel"/>
-    <w:tmpl w:val="897E4784"/>
-    <w:lvl w:ilvl="0" w:tplc="1D7C9776">
+    <w:tmpl w:val="6AF6BB04"/>
+    <w:lvl w:ilvl="0" w:tplc="240435CA">
+      <w:start w:val="1"/>
+      <w:numFmt w:val="bullet"/>
+      <w:lvlText w:val="●"/>
+      <w:lvlJc w:val="left"/>
+      <w:pPr>
+        <w:ind w:left="720" w:hanging="360"/>
+      </w:pPr>
+    </w:lvl>
+    <w:lvl w:ilvl="1" w:tplc="D090A404">
+      <w:start w:val="1"/>
+      <w:numFmt w:val="bullet"/>
+      <w:lvlText w:val="○"/>
+      <w:lvlJc w:val="left"/>
+      <w:pPr>
+        <w:ind w:left="1440" w:hanging="360"/>
+      </w:pPr>
+    </w:lvl>
+    <w:lvl w:ilvl="2" w:tplc="A888DF80">
+      <w:start w:val="1"/>
+      <w:numFmt w:val="bullet"/>
+      <w:lvlText w:val="■"/>
+      <w:lvlJc w:val="left"/>
+      <w:pPr>
+        <w:ind w:left="2160" w:hanging="360"/>
+      </w:pPr>
+    </w:lvl>
+    <w:lvl w:ilvl="3" w:tplc="F654BC54">
+      <w:start w:val="1"/>
+      <w:numFmt w:val="bullet"/>
+      <w:lvlText w:val="●"/>
+      <w:lvlJc w:val="left"/>
+      <w:pPr>
+        <w:ind w:left="2880" w:hanging="360"/>
+      </w:pPr>
+    </w:lvl>
+    <w:lvl w:ilvl="4" w:tplc="823CDD04">
+      <w:start w:val="1"/>
+      <w:numFmt w:val="bullet"/>
+      <w:lvlText w:val="○"/>
+      <w:lvlJc w:val="left"/>
+      <w:pPr>
+        <w:ind w:left="3600" w:hanging="360"/>
+      </w:pPr>
+    </w:lvl>
+    <w:lvl w:ilvl="5" w:tplc="95CADCDC">
+      <w:start w:val="1"/>
+      <w:numFmt w:val="bullet"/>
+      <w:lvlText w:val="■"/>
+      <w:lvlJc w:val="left"/>
+      <w:pPr>
+        <w:ind w:left="4320" w:hanging="360"/>
+      </w:pPr>
+    </w:lvl>
+    <w:lvl w:ilvl="6" w:tplc="8A06A90E">
+      <w:start w:val="1"/>
+      <w:numFmt w:val="bullet"/>
+      <w:lvlText w:val="●"/>
+      <w:lvlJc w:val="left"/>
+      <w:pPr>
+        <w:ind w:left="5040" w:hanging="360"/>
+      </w:pPr>
+    </w:lvl>
+    <w:lvl w:ilvl="7" w:tplc="24C63B3E">
+      <w:start w:val="1"/>
+      <w:numFmt w:val="bullet"/>
+      <w:lvlText w:val="●"/>
+      <w:lvlJc w:val="left"/>
+      <w:pPr>
+        <w:ind w:left="5760" w:hanging="360"/>
+      </w:pPr>
+    </w:lvl>
+    <w:lvl w:ilvl="8" w:tplc="0B6EBC2C">
+      <w:start w:val="1"/>
+      <w:numFmt w:val="bullet"/>
+      <w:lvlText w:val="●"/>
+      <w:lvlJc w:val="left"/>
+      <w:pPr>
+        <w:ind w:left="6480" w:hanging="360"/>
+      </w:pPr>
+    </w:lvl>
+  </w:abstractNum>
+  <w:abstractNum w:abstractNumId="1" w15:restartNumberingAfterBreak="0">
+    <w:nsid w:val="357513CD"/>
+    <w:multiLevelType w:val="hybridMultilevel"/>
+    <w:tmpl w:val="99FE1DFE"/>
+    <w:lvl w:ilvl="0" w:tplc="F64A3EB0">
       <w:start w:val="1"/>
       <w:numFmt w:val="bullet"/>
       <w:lvlText w:val="•"/>
@@ -4073,201 +4649,115 @@
         <w:ind w:left="540" w:hanging="270"/>
       </w:pPr>
     </w:lvl>
-    <w:lvl w:ilvl="1" w:tplc="046ABE46">
+    <w:lvl w:ilvl="1" w:tplc="410E1B36">
       <w:numFmt w:val="decimal"/>
       <w:lvlText w:val=""/>
       <w:lvlJc w:val="left"/>
     </w:lvl>
-    <w:lvl w:ilvl="2" w:tplc="26E6A20A">
+    <w:lvl w:ilvl="2" w:tplc="5942C43C">
       <w:numFmt w:val="decimal"/>
       <w:lvlText w:val=""/>
       <w:lvlJc w:val="left"/>
     </w:lvl>
-    <w:lvl w:ilvl="3" w:tplc="C9B6EA34">
+    <w:lvl w:ilvl="3" w:tplc="EB084994">
       <w:numFmt w:val="decimal"/>
       <w:lvlText w:val=""/>
       <w:lvlJc w:val="left"/>
     </w:lvl>
-    <w:lvl w:ilvl="4" w:tplc="80CA6D3E">
+    <w:lvl w:ilvl="4" w:tplc="05002B68">
       <w:numFmt w:val="decimal"/>
       <w:lvlText w:val=""/>
       <w:lvlJc w:val="left"/>
     </w:lvl>
-    <w:lvl w:ilvl="5" w:tplc="591ACDE8">
+    <w:lvl w:ilvl="5" w:tplc="903E061C">
       <w:numFmt w:val="decimal"/>
       <w:lvlText w:val=""/>
       <w:lvlJc w:val="left"/>
     </w:lvl>
-    <w:lvl w:ilvl="6" w:tplc="F3EE7A30">
+    <w:lvl w:ilvl="6" w:tplc="BFB06D6E">
       <w:numFmt w:val="decimal"/>
       <w:lvlText w:val=""/>
       <w:lvlJc w:val="left"/>
     </w:lvl>
-    <w:lvl w:ilvl="7" w:tplc="FAE853E0">
+    <w:lvl w:ilvl="7" w:tplc="A0DC7F76">
       <w:numFmt w:val="decimal"/>
       <w:lvlText w:val=""/>
       <w:lvlJc w:val="left"/>
     </w:lvl>
-    <w:lvl w:ilvl="8" w:tplc="0E16D886">
-      <w:numFmt w:val="decimal"/>
-      <w:lvlText w:val=""/>
-      <w:lvlJc w:val="left"/>
-    </w:lvl>
-  </w:abstractNum>
-  <w:abstractNum w:abstractNumId="1" w15:restartNumberingAfterBreak="0">
-    <w:nsid w:val="721C5F28"/>
-    <w:multiLevelType w:val="hybridMultilevel"/>
-    <w:tmpl w:val="91F0150E"/>
-    <w:lvl w:ilvl="0" w:tplc="07AC9C82">
-      <w:start w:val="1"/>
-      <w:numFmt w:val="decimal"/>
-      <w:lvlText w:val="%1."/>
-      <w:lvlJc w:val="left"/>
-      <w:pPr>
-        <w:ind w:left="540" w:hanging="360"/>
-      </w:pPr>
-    </w:lvl>
-    <w:lvl w:ilvl="1" w:tplc="ADE4A9EE">
-      <w:numFmt w:val="decimal"/>
-      <w:lvlText w:val=""/>
-      <w:lvlJc w:val="left"/>
-    </w:lvl>
-    <w:lvl w:ilvl="2" w:tplc="C2920892">
-      <w:numFmt w:val="decimal"/>
-      <w:lvlText w:val=""/>
-      <w:lvlJc w:val="left"/>
-    </w:lvl>
-    <w:lvl w:ilvl="3" w:tplc="4DC86EFA">
-      <w:numFmt w:val="decimal"/>
-      <w:lvlText w:val=""/>
-      <w:lvlJc w:val="left"/>
-    </w:lvl>
-    <w:lvl w:ilvl="4" w:tplc="D428A866">
-      <w:numFmt w:val="decimal"/>
-      <w:lvlText w:val=""/>
-      <w:lvlJc w:val="left"/>
-    </w:lvl>
-    <w:lvl w:ilvl="5" w:tplc="DD8A9CE6">
-      <w:numFmt w:val="decimal"/>
-      <w:lvlText w:val=""/>
-      <w:lvlJc w:val="left"/>
-    </w:lvl>
-    <w:lvl w:ilvl="6" w:tplc="94C60680">
-      <w:numFmt w:val="decimal"/>
-      <w:lvlText w:val=""/>
-      <w:lvlJc w:val="left"/>
-    </w:lvl>
-    <w:lvl w:ilvl="7" w:tplc="AC62D9F6">
-      <w:numFmt w:val="decimal"/>
-      <w:lvlText w:val=""/>
-      <w:lvlJc w:val="left"/>
-    </w:lvl>
-    <w:lvl w:ilvl="8" w:tplc="51CC7F0A">
+    <w:lvl w:ilvl="8" w:tplc="378A3144">
       <w:numFmt w:val="decimal"/>
       <w:lvlText w:val=""/>
       <w:lvlJc w:val="left"/>
     </w:lvl>
   </w:abstractNum>
   <w:abstractNum w:abstractNumId="2" w15:restartNumberingAfterBreak="0">
-    <w:nsid w:val="7C853B9F"/>
+    <w:nsid w:val="51667421"/>
     <w:multiLevelType w:val="hybridMultilevel"/>
-    <w:tmpl w:val="4E6E2114"/>
-    <w:lvl w:ilvl="0" w:tplc="7ABE721A">
+    <w:tmpl w:val="CA906EA6"/>
+    <w:lvl w:ilvl="0" w:tplc="3F2CFC74">
       <w:start w:val="1"/>
-      <w:numFmt w:val="bullet"/>
-      <w:lvlText w:val="●"/>
+      <w:numFmt w:val="decimal"/>
+      <w:lvlText w:val="%1."/>
       <w:lvlJc w:val="left"/>
       <w:pPr>
-        <w:ind w:left="720" w:hanging="360"/>
+        <w:ind w:left="540" w:hanging="360"/>
       </w:pPr>
     </w:lvl>
-    <w:lvl w:ilvl="1" w:tplc="BB4C0816">
-      <w:start w:val="1"/>
-      <w:numFmt w:val="bullet"/>
-      <w:lvlText w:val="○"/>
+    <w:lvl w:ilvl="1" w:tplc="993659FC">
+      <w:numFmt w:val="decimal"/>
+      <w:lvlText w:val=""/>
       <w:lvlJc w:val="left"/>
-      <w:pPr>
-        <w:ind w:left="1440" w:hanging="360"/>
-      </w:pPr>
     </w:lvl>
-    <w:lvl w:ilvl="2" w:tplc="AF1C4C68">
-      <w:start w:val="1"/>
-      <w:numFmt w:val="bullet"/>
-      <w:lvlText w:val="■"/>
+    <w:lvl w:ilvl="2" w:tplc="AAEE150E">
+      <w:numFmt w:val="decimal"/>
+      <w:lvlText w:val=""/>
       <w:lvlJc w:val="left"/>
-      <w:pPr>
-        <w:ind w:left="2160" w:hanging="360"/>
-      </w:pPr>
     </w:lvl>
-    <w:lvl w:ilvl="3" w:tplc="BBE280C4">
-      <w:start w:val="1"/>
-      <w:numFmt w:val="bullet"/>
-      <w:lvlText w:val="●"/>
+    <w:lvl w:ilvl="3" w:tplc="FFF4E066">
+      <w:numFmt w:val="decimal"/>
+      <w:lvlText w:val=""/>
       <w:lvlJc w:val="left"/>
-      <w:pPr>
-        <w:ind w:left="2880" w:hanging="360"/>
-      </w:pPr>
     </w:lvl>
-    <w:lvl w:ilvl="4" w:tplc="7FAC77AC">
-      <w:start w:val="1"/>
-      <w:numFmt w:val="bullet"/>
-      <w:lvlText w:val="○"/>
+    <w:lvl w:ilvl="4" w:tplc="3FD2B96A">
+      <w:numFmt w:val="decimal"/>
+      <w:lvlText w:val=""/>
       <w:lvlJc w:val="left"/>
-      <w:pPr>
-        <w:ind w:left="3600" w:hanging="360"/>
-      </w:pPr>
     </w:lvl>
-    <w:lvl w:ilvl="5" w:tplc="A73415D6">
-      <w:start w:val="1"/>
-      <w:numFmt w:val="bullet"/>
-      <w:lvlText w:val="■"/>
+    <w:lvl w:ilvl="5" w:tplc="983A782E">
+      <w:numFmt w:val="decimal"/>
+      <w:lvlText w:val=""/>
       <w:lvlJc w:val="left"/>
-      <w:pPr>
-        <w:ind w:left="4320" w:hanging="360"/>
-      </w:pPr>
     </w:lvl>
-    <w:lvl w:ilvl="6" w:tplc="30B4DFAE">
-      <w:start w:val="1"/>
-      <w:numFmt w:val="bullet"/>
-      <w:lvlText w:val="●"/>
+    <w:lvl w:ilvl="6" w:tplc="ECAC1C0E">
+      <w:numFmt w:val="decimal"/>
+      <w:lvlText w:val=""/>
       <w:lvlJc w:val="left"/>
-      <w:pPr>
-        <w:ind w:left="5040" w:hanging="360"/>
-      </w:pPr>
     </w:lvl>
-    <w:lvl w:ilvl="7" w:tplc="A970B95A">
-      <w:start w:val="1"/>
-      <w:numFmt w:val="bullet"/>
-      <w:lvlText w:val="●"/>
+    <w:lvl w:ilvl="7" w:tplc="A3C2E574">
+      <w:numFmt w:val="decimal"/>
+      <w:lvlText w:val=""/>
       <w:lvlJc w:val="left"/>
-      <w:pPr>
-        <w:ind w:left="5760" w:hanging="360"/>
-      </w:pPr>
     </w:lvl>
-    <w:lvl w:ilvl="8" w:tplc="4D60F01A">
-      <w:start w:val="1"/>
-      <w:numFmt w:val="bullet"/>
-      <w:lvlText w:val="●"/>
+    <w:lvl w:ilvl="8" w:tplc="4DC27D40">
+      <w:numFmt w:val="decimal"/>
+      <w:lvlText w:val=""/>
       <w:lvlJc w:val="left"/>
-      <w:pPr>
-        <w:ind w:left="6480" w:hanging="360"/>
-      </w:pPr>
     </w:lvl>
   </w:abstractNum>
-  <w:num w:numId="1" w16cid:durableId="1766999369">
+  <w:num w:numId="1" w16cid:durableId="78018274">
+    <w:abstractNumId w:val="0"/>
+    <w:lvlOverride w:ilvl="0">
+      <w:startOverride w:val="1"/>
+    </w:lvlOverride>
+  </w:num>
+  <w:num w:numId="2" w16cid:durableId="736363256">
     <w:abstractNumId w:val="2"/>
     <w:lvlOverride w:ilvl="0">
       <w:startOverride w:val="1"/>
     </w:lvlOverride>
   </w:num>
-  <w:num w:numId="2" w16cid:durableId="215625840">
+  <w:num w:numId="3" w16cid:durableId="1787888992">
     <w:abstractNumId w:val="1"/>
-    <w:lvlOverride w:ilvl="0">
-      <w:startOverride w:val="1"/>
-    </w:lvlOverride>
-  </w:num>
-  <w:num w:numId="3" w16cid:durableId="915364416">
-    <w:abstractNumId w:val="0"/>
     <w:lvlOverride w:ilvl="0">
       <w:startOverride w:val="1"/>
     </w:lvlOverride>
@@ -4854,7 +5344,7 @@
     <w:autoRedefine/>
     <w:uiPriority w:val="39"/>
     <w:unhideWhenUsed/>
-    <w:rsid w:val="007C5D15"/>
+    <w:rsid w:val="0083543E"/>
     <w:pPr>
       <w:spacing w:after="100"/>
     </w:pPr>
@@ -4866,7 +5356,7 @@
     <w:autoRedefine/>
     <w:uiPriority w:val="39"/>
     <w:unhideWhenUsed/>
-    <w:rsid w:val="007C5D15"/>
+    <w:rsid w:val="0083543E"/>
     <w:pPr>
       <w:spacing w:after="100"/>
       <w:ind w:left="210"/>

</xml_diff>